<commit_message>
Subindo o resto da anotacoes
</commit_message>
<xml_diff>
--- a/2. Building with the Claude API/Modules_Notes/Modulo2_07_Features_of_Claude.docx
+++ b/2. Building with the Claude API/Modules_Notes/Modulo2_07_Features_of_Claude.docx
@@ -1,6 +1,6 @@
 
 <file path=word/document.xml><?xml version="1.0" encoding="utf-8"?>
-<w:document xmlns:wpc="http://schemas.microsoft.com/office/word/2010/wordprocessingCanvas" xmlns:cx="http://schemas.microsoft.com/office/drawing/2014/chartex" xmlns:cx1="http://schemas.microsoft.com/office/drawing/2015/9/8/chartex" xmlns:cx2="http://schemas.microsoft.com/office/drawing/2015/10/21/chartex" xmlns:cx3="http://schemas.microsoft.com/office/drawing/2016/5/9/chartex" xmlns:cx4="http://schemas.microsoft.com/office/drawing/2016/5/10/chartex" xmlns:cx5="http://schemas.microsoft.com/office/drawing/2016/5/11/chartex" xmlns:cx6="http://schemas.microsoft.com/office/drawing/2016/5/12/chartex" xmlns:cx7="http://schemas.microsoft.com/office/drawing/2016/5/13/chartex" xmlns:cx8="http://schemas.microsoft.com/office/drawing/2016/5/14/chartex" xmlns:mc="http://schemas.openxmlformats.org/markup-compatibility/2006" xmlns:aink="http://schemas.microsoft.com/office/drawing/2016/ink" xmlns:am3d="http://schemas.microsoft.com/office/drawing/2017/model3d" xmlns:o="urn:schemas-microsoft-com:office:office" xmlns:oel="http://schemas.microsoft.com/office/2019/extlst" xmlns:r="http://schemas.openxmlformats.org/officeDocument/2006/relationships" xmlns:m="http://schemas.openxmlformats.org/officeDocument/2006/math" xmlns:v="urn:schemas-microsoft-com:vml" xmlns:wp14="http://schemas.microsoft.com/office/word/2010/wordprocessingDrawing" xmlns:wp="http://schemas.openxmlformats.org/drawingml/2006/wordprocessingDrawing" xmlns:w10="urn:schemas-microsoft-com:office:word" xmlns:w="http://schemas.openxmlformats.org/wordprocessingml/2006/main" xmlns:w14="http://schemas.microsoft.com/office/word/2010/wordml" xmlns:w15="http://schemas.microsoft.com/office/word/2012/wordml" xmlns:w16cex="http://schemas.microsoft.com/office/word/2018/wordml/cex" xmlns:w16cid="http://schemas.microsoft.com/office/word/2016/wordml/cid" xmlns:w16="http://schemas.microsoft.com/office/word/2018/wordml" xmlns:w16du="http://schemas.microsoft.com/office/word/2023/wordml/word16du" xmlns:w16sdtdh="http://schemas.microsoft.com/office/word/2020/wordml/sdtdatahash" xmlns:w16sdtfl="http://schemas.microsoft.com/office/word/2024/wordml/sdtformatlock" xmlns:w16se="http://schemas.microsoft.com/office/word/2015/wordml/symex" xmlns:wpg="http://schemas.microsoft.com/office/word/2010/wordprocessingGroup" xmlns:wpi="http://schemas.microsoft.com/office/word/2010/wordprocessingInk" xmlns:wne="http://schemas.microsoft.com/office/word/2006/wordml" xmlns:wps="http://schemas.microsoft.com/office/word/2010/wordprocessingShape" mc:Ignorable="w14 w15 w16se w16cid w16 w16cex w16sdtdh w16sdtfl w16du wp14">
+<w:document xmlns:wpc="http://schemas.microsoft.com/office/word/2010/wordprocessingCanvas" xmlns:cx="http://schemas.microsoft.com/office/drawing/2014/chartex" xmlns:cx1="http://schemas.microsoft.com/office/drawing/2015/9/8/chartex" xmlns:cx2="http://schemas.microsoft.com/office/drawing/2015/10/21/chartex" xmlns:cx3="http://schemas.microsoft.com/office/drawing/2016/5/9/chartex" xmlns:cx4="http://schemas.microsoft.com/office/drawing/2016/5/10/chartex" xmlns:cx5="http://schemas.microsoft.com/office/drawing/2016/5/11/chartex" xmlns:cx6="http://schemas.microsoft.com/office/drawing/2016/5/12/chartex" xmlns:cx7="http://schemas.microsoft.com/office/drawing/2016/5/13/chartex" xmlns:cx8="http://schemas.microsoft.com/office/drawing/2016/5/14/chartex" xmlns:mc="http://schemas.openxmlformats.org/markup-compatibility/2006" xmlns:aink="http://schemas.microsoft.com/office/drawing/2016/ink" xmlns:am3d="http://schemas.microsoft.com/office/drawing/2017/model3d" xmlns:o="urn:schemas-microsoft-com:office:office" xmlns:oel="http://schemas.microsoft.com/office/2019/extlst" xmlns:r="http://schemas.openxmlformats.org/officeDocument/2006/relationships" xmlns:m="http://schemas.openxmlformats.org/officeDocument/2006/math" xmlns:v="urn:schemas-microsoft-com:vml" xmlns:wp14="http://schemas.microsoft.com/office/word/2010/wordprocessingDrawing" xmlns:wp="http://schemas.openxmlformats.org/drawingml/2006/wordprocessingDrawing" xmlns:w10="urn:schemas-microsoft-com:office:word" xmlns:w="http://schemas.openxmlformats.org/wordprocessingml/2006/main" xmlns:w14="http://schemas.microsoft.com/office/word/2010/wordml" xmlns:w15="http://schemas.microsoft.com/office/word/2012/wordml" xmlns:w16cex="http://schemas.microsoft.com/office/word/2018/wordml/cex" xmlns:w16cid="http://schemas.microsoft.com/office/word/2016/wordml/cid" xmlns:w16="http://schemas.microsoft.com/office/word/2018/wordml" xmlns:w16du="http://schemas.microsoft.com/office/word/2023/wordml/word16du" xmlns:w16sdtdh="http://schemas.microsoft.com/office/word/2020/wordml/sdtdatahash" xmlns:w16sdtfl="http://schemas.microsoft.com/office/word/2024/wordml/sdtformatlock" xmlns:w16se="http://schemas.microsoft.com/office/word/2015/wordml/symex" xmlns:wpg="http://schemas.microsoft.com/office/word/2010/wordprocessingGroup" xmlns:wpi="http://schemas.microsoft.com/office/word/2010/wordprocessingInk" xmlns:wne="http://schemas.microsoft.com/office/word/2006/wordml" xmlns:wps="http://schemas.microsoft.com/office/word/2010/wordprocessingShape" xmlns:a="http://schemas.openxmlformats.org/drawingml/2006/main" xmlns:pic="http://schemas.openxmlformats.org/drawingml/2006/picture" mc:Ignorable="w14 w15 w16se w16cid w16 w16cex w16sdtdh w16sdtfl w16du wp14">
   <w:body>
     <w:p>
       <w:pPr>
@@ -22,7 +22,7 @@
     <w:p>
       <w:pPr>
         <w:pBdr>
-          <w:bottom w:val="single" w:sz="8" w:space="8" w:color="5A3E1B"/>
+          <w:bottom w:val="single" w:color="5A3E1B" w:sz="8" w:space="8"/>
         </w:pBdr>
         <w:spacing w:after="200"/>
         <w:rPr>
@@ -227,7 +227,7 @@
     <w:p>
       <w:pPr>
         <w:pBdr>
-          <w:bottom w:val="single" w:sz="4" w:space="6" w:color="CCCCCC"/>
+          <w:bottom w:val="single" w:color="CCCCCC" w:sz="4" w:space="6"/>
         </w:pBdr>
         <w:spacing w:after="180"/>
         <w:rPr>
@@ -880,7 +880,31 @@
           <w:szCs w:val="20"/>
           <w:lang w:val="en-US"/>
         </w:rPr>
-        <w:t>The chat() helper function that gets extended with thinking and thinking_budget parameters.</w:t>
+        <w:t xml:space="preserve">The </w:t>
+      </w:r>
+      <w:proofErr w:type="gramStart"/>
+      <w:r>
+        <w:rPr>
+          <w:i/>
+          <w:iCs/>
+          <w:color w:val="888888"/>
+          <w:sz w:val="20"/>
+          <w:szCs w:val="20"/>
+          <w:lang w:val="en-US"/>
+        </w:rPr>
+        <w:t>chat(</w:t>
+      </w:r>
+      <w:proofErr w:type="gramEnd"/>
+      <w:r>
+        <w:rPr>
+          <w:i/>
+          <w:iCs/>
+          <w:color w:val="888888"/>
+          <w:sz w:val="20"/>
+          <w:szCs w:val="20"/>
+          <w:lang w:val="en-US"/>
+        </w:rPr>
+        <w:t>) helper function that gets extended with thinking and thinking_budget parameters.</w:t>
       </w:r>
     </w:p>
     <w:p>
@@ -901,8 +925,19 @@
           <w:szCs w:val="20"/>
           <w:lang w:val="en-US"/>
         </w:rPr>
-        <w:t>def chat(</w:t>
-      </w:r>
+        <w:t xml:space="preserve">def </w:t>
+      </w:r>
+      <w:proofErr w:type="gramStart"/>
+      <w:r>
+        <w:rPr>
+          <w:rFonts w:ascii="Consolas" w:hAnsi="Consolas" w:cs="Consolas"/>
+          <w:sz w:val="20"/>
+          <w:szCs w:val="20"/>
+          <w:lang w:val="en-US"/>
+        </w:rPr>
+        <w:t>chat(</w:t>
+      </w:r>
+      <w:proofErr w:type="gramEnd"/>
     </w:p>
     <w:p>
       <w:pPr>
@@ -985,7 +1020,27 @@
           <w:szCs w:val="20"/>
           <w:lang w:val="en-US"/>
         </w:rPr>
-        <w:t xml:space="preserve">    stop_sequences=[],</w:t>
+        <w:t xml:space="preserve">    stop_sequences</w:t>
+      </w:r>
+      <w:proofErr w:type="gramStart"/>
+      <w:r>
+        <w:rPr>
+          <w:rFonts w:ascii="Consolas" w:hAnsi="Consolas" w:cs="Consolas"/>
+          <w:sz w:val="20"/>
+          <w:szCs w:val="20"/>
+          <w:lang w:val="en-US"/>
+        </w:rPr>
+        <w:t>=[</w:t>
+      </w:r>
+      <w:proofErr w:type="gramEnd"/>
+      <w:r>
+        <w:rPr>
+          <w:rFonts w:ascii="Consolas" w:hAnsi="Consolas" w:cs="Consolas"/>
+          <w:sz w:val="20"/>
+          <w:szCs w:val="20"/>
+          <w:lang w:val="en-US"/>
+        </w:rPr>
+        <w:t>],</w:t>
       </w:r>
     </w:p>
     <w:p>
@@ -1216,14 +1271,25 @@
           <w:lang w:val="en-US"/>
         </w:rPr>
       </w:pPr>
-      <w:r>
-        <w:rPr>
-          <w:rFonts w:ascii="Consolas" w:hAnsi="Consolas" w:cs="Consolas"/>
-          <w:sz w:val="20"/>
-          <w:szCs w:val="20"/>
-          <w:lang w:val="en-US"/>
-        </w:rPr>
-        <w:t>chat(messages, thinking=True)</w:t>
+      <w:proofErr w:type="gramStart"/>
+      <w:r>
+        <w:rPr>
+          <w:rFonts w:ascii="Consolas" w:hAnsi="Consolas" w:cs="Consolas"/>
+          <w:sz w:val="20"/>
+          <w:szCs w:val="20"/>
+          <w:lang w:val="en-US"/>
+        </w:rPr>
+        <w:t>chat(</w:t>
+      </w:r>
+      <w:proofErr w:type="gramEnd"/>
+      <w:r>
+        <w:rPr>
+          <w:rFonts w:ascii="Consolas" w:hAnsi="Consolas" w:cs="Consolas"/>
+          <w:sz w:val="20"/>
+          <w:szCs w:val="20"/>
+          <w:lang w:val="en-US"/>
+        </w:rPr>
+        <w:t>messages, thinking=True)</w:t>
       </w:r>
     </w:p>
     <w:p>
@@ -1307,6 +1373,7 @@
       <w:r>
         <w:rPr>
           <w:rFonts w:ascii="Arial" w:hAnsi="Arial" w:cs="Arial"/>
+          <w:highlight w:val="yellow"/>
           <w:lang w:val="en-US"/>
         </w:rPr>
         <w:t>B) A feature that gives Claude time to reason through a problem before the final answer, shown as a separate thinking block</w:t>
@@ -1411,6 +1478,7 @@
       <w:r>
         <w:rPr>
           <w:rFonts w:ascii="Arial" w:hAnsi="Arial" w:cs="Arial"/>
+          <w:highlight w:val="yellow"/>
           <w:lang w:val="en-US"/>
         </w:rPr>
         <w:t>B) Increased accuracy on difficult problems</w:t>
@@ -1531,6 +1599,7 @@
       <w:r>
         <w:rPr>
           <w:rFonts w:ascii="Arial" w:hAnsi="Arial" w:cs="Arial"/>
+          <w:highlight w:val="yellow"/>
           <w:lang w:val="en-US"/>
         </w:rPr>
         <w:t>C) After running prompt evaluations without thinking and finding accuracy still isn't sufficient once the prompt is already optimized</w:t>
@@ -1634,6 +1703,7 @@
       <w:r>
         <w:rPr>
           <w:rFonts w:ascii="Arial" w:hAnsi="Arial" w:cs="Arial"/>
+          <w:highlight w:val="yellow"/>
           <w:lang w:val="en-US"/>
         </w:rPr>
         <w:t>C) That the thinking text is exactly what Claude generated and was not modified</w:t>
@@ -1737,6 +1807,7 @@
       <w:r>
         <w:rPr>
           <w:rFonts w:ascii="Arial" w:hAnsi="Arial" w:cs="Arial"/>
+          <w:highlight w:val="yellow"/>
           <w:lang w:val="en-US"/>
         </w:rPr>
         <w:t>C) Claude's internal reasoning gets flagged by safety systems</w:t>
@@ -1823,6 +1894,7 @@
       <w:r>
         <w:rPr>
           <w:rFonts w:ascii="Arial" w:hAnsi="Arial" w:cs="Arial"/>
+          <w:highlight w:val="yellow"/>
           <w:lang w:val="en-US"/>
         </w:rPr>
         <w:lastRenderedPageBreak/>
@@ -2121,7 +2193,35 @@
         <w:rPr>
           <w:lang w:val="en-US"/>
         </w:rPr>
-        <w:t xml:space="preserve"> — each image counts as tokens = (width px × height px) / 750.</w:t>
+        <w:t xml:space="preserve"> — each image counts as tokens = (width </w:t>
+      </w:r>
+      <w:proofErr w:type="spellStart"/>
+      <w:r>
+        <w:rPr>
+          <w:lang w:val="en-US"/>
+        </w:rPr>
+        <w:t>px</w:t>
+      </w:r>
+      <w:proofErr w:type="spellEnd"/>
+      <w:r>
+        <w:rPr>
+          <w:lang w:val="en-US"/>
+        </w:rPr>
+        <w:t xml:space="preserve"> × height </w:t>
+      </w:r>
+      <w:proofErr w:type="spellStart"/>
+      <w:r>
+        <w:rPr>
+          <w:lang w:val="en-US"/>
+        </w:rPr>
+        <w:t>px</w:t>
+      </w:r>
+      <w:proofErr w:type="spellEnd"/>
+      <w:r>
+        <w:rPr>
+          <w:lang w:val="en-US"/>
+        </w:rPr>
+        <w:t>) / 750.</w:t>
       </w:r>
     </w:p>
     <w:p>
@@ -2245,7 +2345,47 @@
           <w:szCs w:val="20"/>
           <w:lang w:val="en-US"/>
         </w:rPr>
-        <w:t>with open("image.png", "rb") as f:</w:t>
+        <w:t xml:space="preserve">with </w:t>
+      </w:r>
+      <w:proofErr w:type="gramStart"/>
+      <w:r>
+        <w:rPr>
+          <w:rFonts w:ascii="Consolas" w:hAnsi="Consolas" w:cs="Consolas"/>
+          <w:sz w:val="20"/>
+          <w:szCs w:val="20"/>
+          <w:lang w:val="en-US"/>
+        </w:rPr>
+        <w:t>open(</w:t>
+      </w:r>
+      <w:proofErr w:type="gramEnd"/>
+      <w:r>
+        <w:rPr>
+          <w:rFonts w:ascii="Consolas" w:hAnsi="Consolas" w:cs="Consolas"/>
+          <w:sz w:val="20"/>
+          <w:szCs w:val="20"/>
+          <w:lang w:val="en-US"/>
+        </w:rPr>
+        <w:t>"image.png", "</w:t>
+      </w:r>
+      <w:proofErr w:type="spellStart"/>
+      <w:r>
+        <w:rPr>
+          <w:rFonts w:ascii="Consolas" w:hAnsi="Consolas" w:cs="Consolas"/>
+          <w:sz w:val="20"/>
+          <w:szCs w:val="20"/>
+          <w:lang w:val="en-US"/>
+        </w:rPr>
+        <w:t>rb</w:t>
+      </w:r>
+      <w:proofErr w:type="spellEnd"/>
+      <w:r>
+        <w:rPr>
+          <w:rFonts w:ascii="Consolas" w:hAnsi="Consolas" w:cs="Consolas"/>
+          <w:sz w:val="20"/>
+          <w:szCs w:val="20"/>
+          <w:lang w:val="en-US"/>
+        </w:rPr>
+        <w:t>") as f:</w:t>
       </w:r>
     </w:p>
     <w:p>
@@ -2266,8 +2406,39 @@
           <w:szCs w:val="20"/>
           <w:lang w:val="en-US"/>
         </w:rPr>
-        <w:t xml:space="preserve">    image_bytes = base64.standard_b64encode(</w:t>
-      </w:r>
+        <w:t xml:space="preserve">    </w:t>
+      </w:r>
+      <w:proofErr w:type="spellStart"/>
+      <w:r>
+        <w:rPr>
+          <w:rFonts w:ascii="Consolas" w:hAnsi="Consolas" w:cs="Consolas"/>
+          <w:sz w:val="20"/>
+          <w:szCs w:val="20"/>
+          <w:lang w:val="en-US"/>
+        </w:rPr>
+        <w:t>image_bytes</w:t>
+      </w:r>
+      <w:proofErr w:type="spellEnd"/>
+      <w:r>
+        <w:rPr>
+          <w:rFonts w:ascii="Consolas" w:hAnsi="Consolas" w:cs="Consolas"/>
+          <w:sz w:val="20"/>
+          <w:szCs w:val="20"/>
+          <w:lang w:val="en-US"/>
+        </w:rPr>
+        <w:t xml:space="preserve"> = base64.standard_b64</w:t>
+      </w:r>
+      <w:proofErr w:type="gramStart"/>
+      <w:r>
+        <w:rPr>
+          <w:rFonts w:ascii="Consolas" w:hAnsi="Consolas" w:cs="Consolas"/>
+          <w:sz w:val="20"/>
+          <w:szCs w:val="20"/>
+          <w:lang w:val="en-US"/>
+        </w:rPr>
+        <w:t>encode(</w:t>
+      </w:r>
+      <w:proofErr w:type="gramEnd"/>
     </w:p>
     <w:p>
       <w:pPr>
@@ -2287,7 +2458,29 @@
           <w:szCs w:val="20"/>
           <w:lang w:val="en-US"/>
         </w:rPr>
-        <w:t xml:space="preserve">        f.read()</w:t>
+        <w:t xml:space="preserve">        </w:t>
+      </w:r>
+      <w:proofErr w:type="spellStart"/>
+      <w:proofErr w:type="gramStart"/>
+      <w:r>
+        <w:rPr>
+          <w:rFonts w:ascii="Consolas" w:hAnsi="Consolas" w:cs="Consolas"/>
+          <w:sz w:val="20"/>
+          <w:szCs w:val="20"/>
+          <w:lang w:val="en-US"/>
+        </w:rPr>
+        <w:t>f.read</w:t>
+      </w:r>
+      <w:proofErr w:type="spellEnd"/>
+      <w:proofErr w:type="gramEnd"/>
+      <w:r>
+        <w:rPr>
+          <w:rFonts w:ascii="Consolas" w:hAnsi="Consolas" w:cs="Consolas"/>
+          <w:sz w:val="20"/>
+          <w:szCs w:val="20"/>
+          <w:lang w:val="en-US"/>
+        </w:rPr>
+        <w:t>()</w:t>
       </w:r>
     </w:p>
     <w:p>
@@ -2308,7 +2501,27 @@
           <w:szCs w:val="20"/>
           <w:lang w:val="en-US"/>
         </w:rPr>
-        <w:t xml:space="preserve">    ).decode("utf-8")</w:t>
+        <w:t xml:space="preserve">    </w:t>
+      </w:r>
+      <w:proofErr w:type="gramStart"/>
+      <w:r>
+        <w:rPr>
+          <w:rFonts w:ascii="Consolas" w:hAnsi="Consolas" w:cs="Consolas"/>
+          <w:sz w:val="20"/>
+          <w:szCs w:val="20"/>
+          <w:lang w:val="en-US"/>
+        </w:rPr>
+        <w:t>).decode</w:t>
+      </w:r>
+      <w:proofErr w:type="gramEnd"/>
+      <w:r>
+        <w:rPr>
+          <w:rFonts w:ascii="Consolas" w:hAnsi="Consolas" w:cs="Consolas"/>
+          <w:sz w:val="20"/>
+          <w:szCs w:val="20"/>
+          <w:lang w:val="en-US"/>
+        </w:rPr>
+        <w:t>("utf-8")</w:t>
       </w:r>
     </w:p>
     <w:p>
@@ -2343,14 +2556,45 @@
           <w:lang w:val="en-US"/>
         </w:rPr>
       </w:pPr>
-      <w:r>
-        <w:rPr>
-          <w:rFonts w:ascii="Consolas" w:hAnsi="Consolas" w:cs="Consolas"/>
-          <w:sz w:val="20"/>
-          <w:szCs w:val="20"/>
-          <w:lang w:val="en-US"/>
-        </w:rPr>
-        <w:t>add_user_message(messages, [</w:t>
+      <w:proofErr w:type="spellStart"/>
+      <w:r>
+        <w:rPr>
+          <w:rFonts w:ascii="Consolas" w:hAnsi="Consolas" w:cs="Consolas"/>
+          <w:sz w:val="20"/>
+          <w:szCs w:val="20"/>
+          <w:lang w:val="en-US"/>
+        </w:rPr>
+        <w:t>add_user_</w:t>
+      </w:r>
+      <w:proofErr w:type="gramStart"/>
+      <w:r>
+        <w:rPr>
+          <w:rFonts w:ascii="Consolas" w:hAnsi="Consolas" w:cs="Consolas"/>
+          <w:sz w:val="20"/>
+          <w:szCs w:val="20"/>
+          <w:lang w:val="en-US"/>
+        </w:rPr>
+        <w:t>message</w:t>
+      </w:r>
+      <w:proofErr w:type="spellEnd"/>
+      <w:r>
+        <w:rPr>
+          <w:rFonts w:ascii="Consolas" w:hAnsi="Consolas" w:cs="Consolas"/>
+          <w:sz w:val="20"/>
+          <w:szCs w:val="20"/>
+          <w:lang w:val="en-US"/>
+        </w:rPr>
+        <w:t>(</w:t>
+      </w:r>
+      <w:proofErr w:type="gramEnd"/>
+      <w:r>
+        <w:rPr>
+          <w:rFonts w:ascii="Consolas" w:hAnsi="Consolas" w:cs="Consolas"/>
+          <w:sz w:val="20"/>
+          <w:szCs w:val="20"/>
+          <w:lang w:val="en-US"/>
+        </w:rPr>
+        <w:t>messages, [</w:t>
       </w:r>
     </w:p>
     <w:p>
@@ -2477,7 +2721,47 @@
           <w:szCs w:val="20"/>
           <w:lang w:val="en-US"/>
         </w:rPr>
-        <w:t xml:space="preserve">            "media_type": "image/png",</w:t>
+        <w:t xml:space="preserve">            "</w:t>
+      </w:r>
+      <w:proofErr w:type="gramStart"/>
+      <w:r>
+        <w:rPr>
+          <w:rFonts w:ascii="Consolas" w:hAnsi="Consolas" w:cs="Consolas"/>
+          <w:sz w:val="20"/>
+          <w:szCs w:val="20"/>
+          <w:lang w:val="en-US"/>
+        </w:rPr>
+        <w:t>media</w:t>
+      </w:r>
+      <w:proofErr w:type="gramEnd"/>
+      <w:r>
+        <w:rPr>
+          <w:rFonts w:ascii="Consolas" w:hAnsi="Consolas" w:cs="Consolas"/>
+          <w:sz w:val="20"/>
+          <w:szCs w:val="20"/>
+          <w:lang w:val="en-US"/>
+        </w:rPr>
+        <w:t>_type": "image/</w:t>
+      </w:r>
+      <w:proofErr w:type="spellStart"/>
+      <w:r>
+        <w:rPr>
+          <w:rFonts w:ascii="Consolas" w:hAnsi="Consolas" w:cs="Consolas"/>
+          <w:sz w:val="20"/>
+          <w:szCs w:val="20"/>
+          <w:lang w:val="en-US"/>
+        </w:rPr>
+        <w:t>png</w:t>
+      </w:r>
+      <w:proofErr w:type="spellEnd"/>
+      <w:r>
+        <w:rPr>
+          <w:rFonts w:ascii="Consolas" w:hAnsi="Consolas" w:cs="Consolas"/>
+          <w:sz w:val="20"/>
+          <w:szCs w:val="20"/>
+          <w:lang w:val="en-US"/>
+        </w:rPr>
+        <w:t>",</w:t>
       </w:r>
     </w:p>
     <w:p>
@@ -2498,7 +2782,27 @@
           <w:szCs w:val="20"/>
           <w:lang w:val="en-US"/>
         </w:rPr>
-        <w:t xml:space="preserve">            "data": image_bytes,</w:t>
+        <w:t xml:space="preserve">            "data": </w:t>
+      </w:r>
+      <w:proofErr w:type="spellStart"/>
+      <w:r>
+        <w:rPr>
+          <w:rFonts w:ascii="Consolas" w:hAnsi="Consolas" w:cs="Consolas"/>
+          <w:sz w:val="20"/>
+          <w:szCs w:val="20"/>
+          <w:lang w:val="en-US"/>
+        </w:rPr>
+        <w:t>image_bytes</w:t>
+      </w:r>
+      <w:proofErr w:type="spellEnd"/>
+      <w:r>
+        <w:rPr>
+          <w:rFonts w:ascii="Consolas" w:hAnsi="Consolas" w:cs="Consolas"/>
+          <w:sz w:val="20"/>
+          <w:szCs w:val="20"/>
+          <w:lang w:val="en-US"/>
+        </w:rPr>
+        <w:t>,</w:t>
       </w:r>
     </w:p>
     <w:p>
@@ -3336,6 +3640,7 @@
       <w:r>
         <w:rPr>
           <w:rFonts w:ascii="Arial" w:hAnsi="Arial" w:cs="Arial"/>
+          <w:highlight w:val="yellow"/>
           <w:lang w:val="en-US"/>
         </w:rPr>
         <w:t>D) 100</w:t>
@@ -3422,6 +3727,7 @@
       <w:r>
         <w:rPr>
           <w:rFonts w:ascii="Arial" w:hAnsi="Arial" w:cs="Arial"/>
+          <w:highlight w:val="yellow"/>
           <w:lang w:val="en-US"/>
         </w:rPr>
         <w:t>C) 8000px</w:t>
@@ -3508,26 +3814,95 @@
       <w:r>
         <w:rPr>
           <w:rFonts w:ascii="Arial" w:hAnsi="Arial" w:cs="Arial"/>
-          <w:lang w:val="en-US"/>
-        </w:rPr>
-        <w:t>B) (width px × height px) / 750</w:t>
-      </w:r>
-    </w:p>
-    <w:p>
-      <w:pPr>
-        <w:spacing w:after="60" w:line="300" w:lineRule="auto"/>
-        <w:ind w:left="400"/>
-        <w:rPr>
-          <w:rFonts w:ascii="Arial" w:hAnsi="Arial" w:cs="Arial"/>
-          <w:lang w:val="en-US"/>
-        </w:rPr>
-      </w:pPr>
-      <w:r>
-        <w:rPr>
-          <w:rFonts w:ascii="Arial" w:hAnsi="Arial" w:cs="Arial"/>
-          <w:lang w:val="en-US"/>
-        </w:rPr>
-        <w:t>C) (width px + height px) / 2</w:t>
+          <w:highlight w:val="yellow"/>
+          <w:lang w:val="en-US"/>
+        </w:rPr>
+        <w:t xml:space="preserve">B) (width </w:t>
+      </w:r>
+      <w:proofErr w:type="spellStart"/>
+      <w:r>
+        <w:rPr>
+          <w:rFonts w:ascii="Arial" w:hAnsi="Arial" w:cs="Arial"/>
+          <w:highlight w:val="yellow"/>
+          <w:lang w:val="en-US"/>
+        </w:rPr>
+        <w:t>px</w:t>
+      </w:r>
+      <w:proofErr w:type="spellEnd"/>
+      <w:r>
+        <w:rPr>
+          <w:rFonts w:ascii="Arial" w:hAnsi="Arial" w:cs="Arial"/>
+          <w:highlight w:val="yellow"/>
+          <w:lang w:val="en-US"/>
+        </w:rPr>
+        <w:t xml:space="preserve"> × height </w:t>
+      </w:r>
+      <w:proofErr w:type="spellStart"/>
+      <w:r>
+        <w:rPr>
+          <w:rFonts w:ascii="Arial" w:hAnsi="Arial" w:cs="Arial"/>
+          <w:highlight w:val="yellow"/>
+          <w:lang w:val="en-US"/>
+        </w:rPr>
+        <w:t>px</w:t>
+      </w:r>
+      <w:proofErr w:type="spellEnd"/>
+      <w:r>
+        <w:rPr>
+          <w:rFonts w:ascii="Arial" w:hAnsi="Arial" w:cs="Arial"/>
+          <w:highlight w:val="yellow"/>
+          <w:lang w:val="en-US"/>
+        </w:rPr>
+        <w:t>) / 750</w:t>
+      </w:r>
+    </w:p>
+    <w:p>
+      <w:pPr>
+        <w:spacing w:after="60" w:line="300" w:lineRule="auto"/>
+        <w:ind w:left="400"/>
+        <w:rPr>
+          <w:rFonts w:ascii="Arial" w:hAnsi="Arial" w:cs="Arial"/>
+          <w:lang w:val="en-US"/>
+        </w:rPr>
+      </w:pPr>
+      <w:r>
+        <w:rPr>
+          <w:rFonts w:ascii="Arial" w:hAnsi="Arial" w:cs="Arial"/>
+          <w:lang w:val="en-US"/>
+        </w:rPr>
+        <w:t xml:space="preserve">C) (width </w:t>
+      </w:r>
+      <w:proofErr w:type="spellStart"/>
+      <w:r>
+        <w:rPr>
+          <w:rFonts w:ascii="Arial" w:hAnsi="Arial" w:cs="Arial"/>
+          <w:lang w:val="en-US"/>
+        </w:rPr>
+        <w:t>px</w:t>
+      </w:r>
+      <w:proofErr w:type="spellEnd"/>
+      <w:r>
+        <w:rPr>
+          <w:rFonts w:ascii="Arial" w:hAnsi="Arial" w:cs="Arial"/>
+          <w:lang w:val="en-US"/>
+        </w:rPr>
+        <w:t xml:space="preserve"> + height </w:t>
+      </w:r>
+      <w:proofErr w:type="spellStart"/>
+      <w:r>
+        <w:rPr>
+          <w:rFonts w:ascii="Arial" w:hAnsi="Arial" w:cs="Arial"/>
+          <w:lang w:val="en-US"/>
+        </w:rPr>
+        <w:t>px</w:t>
+      </w:r>
+      <w:proofErr w:type="spellEnd"/>
+      <w:r>
+        <w:rPr>
+          <w:rFonts w:ascii="Arial" w:hAnsi="Arial" w:cs="Arial"/>
+          <w:lang w:val="en-US"/>
+        </w:rPr>
+        <w:t>) / 2</w:t>
       </w:r>
     </w:p>
     <w:p>
@@ -3628,6 +4003,7 @@
       <w:r>
         <w:rPr>
           <w:rFonts w:ascii="Arial" w:hAnsi="Arial" w:cs="Arial"/>
+          <w:highlight w:val="yellow"/>
           <w:lang w:val="en-US"/>
         </w:rPr>
         <w:lastRenderedPageBreak/>
@@ -3715,6 +4091,7 @@
       <w:r>
         <w:rPr>
           <w:rFonts w:ascii="Arial" w:hAnsi="Arial" w:cs="Arial"/>
+          <w:highlight w:val="yellow"/>
           <w:lang w:val="en-US"/>
         </w:rPr>
         <w:t>B) Detailed guidelines and analysis steps, one-shot/multi-shot examples, and breaking tasks into smaller steps</w:t>
@@ -3818,6 +4195,7 @@
       <w:r>
         <w:rPr>
           <w:rFonts w:ascii="Arial" w:hAnsi="Arial" w:cs="Arial"/>
+          <w:highlight w:val="yellow"/>
           <w:lang w:val="en-US"/>
         </w:rPr>
         <w:t>B) A one-sentence summary per analysis step, ending in a numerical Fire Risk Rating from 1 to 4</w:t>
@@ -3982,7 +4360,47 @@
           <w:szCs w:val="20"/>
           <w:lang w:val="en-US"/>
         </w:rPr>
-        <w:t>with open("earth.pdf", "rb") as f:</w:t>
+        <w:t xml:space="preserve">with </w:t>
+      </w:r>
+      <w:proofErr w:type="gramStart"/>
+      <w:r>
+        <w:rPr>
+          <w:rFonts w:ascii="Consolas" w:hAnsi="Consolas" w:cs="Consolas"/>
+          <w:sz w:val="20"/>
+          <w:szCs w:val="20"/>
+          <w:lang w:val="en-US"/>
+        </w:rPr>
+        <w:t>open(</w:t>
+      </w:r>
+      <w:proofErr w:type="gramEnd"/>
+      <w:r>
+        <w:rPr>
+          <w:rFonts w:ascii="Consolas" w:hAnsi="Consolas" w:cs="Consolas"/>
+          <w:sz w:val="20"/>
+          <w:szCs w:val="20"/>
+          <w:lang w:val="en-US"/>
+        </w:rPr>
+        <w:t>"earth.pdf", "</w:t>
+      </w:r>
+      <w:proofErr w:type="spellStart"/>
+      <w:r>
+        <w:rPr>
+          <w:rFonts w:ascii="Consolas" w:hAnsi="Consolas" w:cs="Consolas"/>
+          <w:sz w:val="20"/>
+          <w:szCs w:val="20"/>
+          <w:lang w:val="en-US"/>
+        </w:rPr>
+        <w:t>rb</w:t>
+      </w:r>
+      <w:proofErr w:type="spellEnd"/>
+      <w:r>
+        <w:rPr>
+          <w:rFonts w:ascii="Consolas" w:hAnsi="Consolas" w:cs="Consolas"/>
+          <w:sz w:val="20"/>
+          <w:szCs w:val="20"/>
+          <w:lang w:val="en-US"/>
+        </w:rPr>
+        <w:t>") as f:</w:t>
       </w:r>
     </w:p>
     <w:p>
@@ -4003,7 +4421,69 @@
           <w:szCs w:val="20"/>
           <w:lang w:val="en-US"/>
         </w:rPr>
-        <w:t xml:space="preserve">    file_bytes = base64.standard_b64encode(f.read()).decode("utf-8")</w:t>
+        <w:t xml:space="preserve">    </w:t>
+      </w:r>
+      <w:proofErr w:type="spellStart"/>
+      <w:r>
+        <w:rPr>
+          <w:rFonts w:ascii="Consolas" w:hAnsi="Consolas" w:cs="Consolas"/>
+          <w:sz w:val="20"/>
+          <w:szCs w:val="20"/>
+          <w:lang w:val="en-US"/>
+        </w:rPr>
+        <w:t>file_bytes</w:t>
+      </w:r>
+      <w:proofErr w:type="spellEnd"/>
+      <w:r>
+        <w:rPr>
+          <w:rFonts w:ascii="Consolas" w:hAnsi="Consolas" w:cs="Consolas"/>
+          <w:sz w:val="20"/>
+          <w:szCs w:val="20"/>
+          <w:lang w:val="en-US"/>
+        </w:rPr>
+        <w:t xml:space="preserve"> = base64.standard_b64encode(</w:t>
+      </w:r>
+      <w:proofErr w:type="spellStart"/>
+      <w:proofErr w:type="gramStart"/>
+      <w:r>
+        <w:rPr>
+          <w:rFonts w:ascii="Consolas" w:hAnsi="Consolas" w:cs="Consolas"/>
+          <w:sz w:val="20"/>
+          <w:szCs w:val="20"/>
+          <w:lang w:val="en-US"/>
+        </w:rPr>
+        <w:t>f.read</w:t>
+      </w:r>
+      <w:proofErr w:type="spellEnd"/>
+      <w:proofErr w:type="gramEnd"/>
+      <w:r>
+        <w:rPr>
+          <w:rFonts w:ascii="Consolas" w:hAnsi="Consolas" w:cs="Consolas"/>
+          <w:sz w:val="20"/>
+          <w:szCs w:val="20"/>
+          <w:lang w:val="en-US"/>
+        </w:rPr>
+        <w:t>()</w:t>
+      </w:r>
+      <w:proofErr w:type="gramStart"/>
+      <w:r>
+        <w:rPr>
+          <w:rFonts w:ascii="Consolas" w:hAnsi="Consolas" w:cs="Consolas"/>
+          <w:sz w:val="20"/>
+          <w:szCs w:val="20"/>
+          <w:lang w:val="en-US"/>
+        </w:rPr>
+        <w:t>).decode</w:t>
+      </w:r>
+      <w:proofErr w:type="gramEnd"/>
+      <w:r>
+        <w:rPr>
+          <w:rFonts w:ascii="Consolas" w:hAnsi="Consolas" w:cs="Consolas"/>
+          <w:sz w:val="20"/>
+          <w:szCs w:val="20"/>
+          <w:lang w:val="en-US"/>
+        </w:rPr>
+        <w:t>("utf-8")</w:t>
       </w:r>
     </w:p>
     <w:p>
@@ -4080,15 +4560,37 @@
           <w:lang w:val="en-US"/>
         </w:rPr>
       </w:pPr>
-      <w:r>
-        <w:rPr>
-          <w:rFonts w:ascii="Consolas" w:hAnsi="Consolas" w:cs="Consolas"/>
-          <w:sz w:val="20"/>
-          <w:szCs w:val="20"/>
-          <w:lang w:val="en-US"/>
-        </w:rPr>
-        <w:t>add_user_message(</w:t>
-      </w:r>
+      <w:proofErr w:type="spellStart"/>
+      <w:r>
+        <w:rPr>
+          <w:rFonts w:ascii="Consolas" w:hAnsi="Consolas" w:cs="Consolas"/>
+          <w:sz w:val="20"/>
+          <w:szCs w:val="20"/>
+          <w:lang w:val="en-US"/>
+        </w:rPr>
+        <w:t>add_user_</w:t>
+      </w:r>
+      <w:proofErr w:type="gramStart"/>
+      <w:r>
+        <w:rPr>
+          <w:rFonts w:ascii="Consolas" w:hAnsi="Consolas" w:cs="Consolas"/>
+          <w:sz w:val="20"/>
+          <w:szCs w:val="20"/>
+          <w:lang w:val="en-US"/>
+        </w:rPr>
+        <w:t>message</w:t>
+      </w:r>
+      <w:proofErr w:type="spellEnd"/>
+      <w:r>
+        <w:rPr>
+          <w:rFonts w:ascii="Consolas" w:hAnsi="Consolas" w:cs="Consolas"/>
+          <w:sz w:val="20"/>
+          <w:szCs w:val="20"/>
+          <w:lang w:val="en-US"/>
+        </w:rPr>
+        <w:t>(</w:t>
+      </w:r>
+      <w:proofErr w:type="gramEnd"/>
     </w:p>
     <w:p>
       <w:pPr>
@@ -4234,7 +4736,27 @@
           <w:szCs w:val="20"/>
           <w:lang w:val="en-US"/>
         </w:rPr>
-        <w:t xml:space="preserve">                "media_type": "application/pdf",</w:t>
+        <w:t xml:space="preserve">                "</w:t>
+      </w:r>
+      <w:proofErr w:type="gramStart"/>
+      <w:r>
+        <w:rPr>
+          <w:rFonts w:ascii="Consolas" w:hAnsi="Consolas" w:cs="Consolas"/>
+          <w:sz w:val="20"/>
+          <w:szCs w:val="20"/>
+          <w:lang w:val="en-US"/>
+        </w:rPr>
+        <w:t>media</w:t>
+      </w:r>
+      <w:proofErr w:type="gramEnd"/>
+      <w:r>
+        <w:rPr>
+          <w:rFonts w:ascii="Consolas" w:hAnsi="Consolas" w:cs="Consolas"/>
+          <w:sz w:val="20"/>
+          <w:szCs w:val="20"/>
+          <w:lang w:val="en-US"/>
+        </w:rPr>
+        <w:t>_type": "application/pdf",</w:t>
       </w:r>
     </w:p>
     <w:p>
@@ -4255,7 +4777,27 @@
           <w:szCs w:val="20"/>
           <w:lang w:val="en-US"/>
         </w:rPr>
-        <w:t xml:space="preserve">                "data": file_bytes,</w:t>
+        <w:t xml:space="preserve">                "data": </w:t>
+      </w:r>
+      <w:proofErr w:type="spellStart"/>
+      <w:r>
+        <w:rPr>
+          <w:rFonts w:ascii="Consolas" w:hAnsi="Consolas" w:cs="Consolas"/>
+          <w:sz w:val="20"/>
+          <w:szCs w:val="20"/>
+          <w:lang w:val="en-US"/>
+        </w:rPr>
+        <w:t>file_bytes</w:t>
+      </w:r>
+      <w:proofErr w:type="spellEnd"/>
+      <w:r>
+        <w:rPr>
+          <w:rFonts w:ascii="Consolas" w:hAnsi="Consolas" w:cs="Consolas"/>
+          <w:sz w:val="20"/>
+          <w:szCs w:val="20"/>
+          <w:lang w:val="en-US"/>
+        </w:rPr>
+        <w:t>,</w:t>
       </w:r>
     </w:p>
     <w:p>
@@ -4450,7 +4992,21 @@
         <w:rPr>
           <w:lang w:val="en-US"/>
         </w:rPr>
-        <w:t xml:space="preserve"> — from .png to .pdf.</w:t>
+        <w:t xml:space="preserve"> — from .</w:t>
+      </w:r>
+      <w:proofErr w:type="spellStart"/>
+      <w:r>
+        <w:rPr>
+          <w:lang w:val="en-US"/>
+        </w:rPr>
+        <w:t>png</w:t>
+      </w:r>
+      <w:proofErr w:type="spellEnd"/>
+      <w:r>
+        <w:rPr>
+          <w:lang w:val="en-US"/>
+        </w:rPr>
+        <w:t xml:space="preserve"> to .pdf.</w:t>
       </w:r>
     </w:p>
     <w:p>
@@ -4478,7 +5034,35 @@
         <w:rPr>
           <w:lang w:val="en-US"/>
         </w:rPr>
-        <w:t xml:space="preserve"> — from image_bytes to file_bytes, for clarity.</w:t>
+        <w:t xml:space="preserve"> — from </w:t>
+      </w:r>
+      <w:proofErr w:type="spellStart"/>
+      <w:r>
+        <w:rPr>
+          <w:lang w:val="en-US"/>
+        </w:rPr>
+        <w:t>image_bytes</w:t>
+      </w:r>
+      <w:proofErr w:type="spellEnd"/>
+      <w:r>
+        <w:rPr>
+          <w:lang w:val="en-US"/>
+        </w:rPr>
+        <w:t xml:space="preserve"> to </w:t>
+      </w:r>
+      <w:proofErr w:type="spellStart"/>
+      <w:r>
+        <w:rPr>
+          <w:lang w:val="en-US"/>
+        </w:rPr>
+        <w:t>file_bytes</w:t>
+      </w:r>
+      <w:proofErr w:type="spellEnd"/>
+      <w:r>
+        <w:rPr>
+          <w:lang w:val="en-US"/>
+        </w:rPr>
+        <w:t>, for clarity.</w:t>
       </w:r>
     </w:p>
     <w:p>
@@ -4534,7 +5118,21 @@
         <w:rPr>
           <w:lang w:val="en-US"/>
         </w:rPr>
-        <w:t xml:space="preserve"> — "application/pdf" instead of "image/png".</w:t>
+        <w:t xml:space="preserve"> — "application/pdf" instead of "image/</w:t>
+      </w:r>
+      <w:proofErr w:type="spellStart"/>
+      <w:r>
+        <w:rPr>
+          <w:lang w:val="en-US"/>
+        </w:rPr>
+        <w:t>png</w:t>
+      </w:r>
+      <w:proofErr w:type="spellEnd"/>
+      <w:r>
+        <w:rPr>
+          <w:lang w:val="en-US"/>
+        </w:rPr>
+        <w:t>".</w:t>
       </w:r>
     </w:p>
     <w:p>
@@ -4728,6 +5326,7 @@
       <w:r>
         <w:rPr>
           <w:rFonts w:ascii="Arial" w:hAnsi="Arial" w:cs="Arial"/>
+          <w:highlight w:val="yellow"/>
           <w:lang w:val="en-US"/>
         </w:rPr>
         <w:t>B) It uses nearly identical code, with a few key differences in type and media_type</w:t>
@@ -4808,13 +5407,11 @@
         <w:ind w:left="400"/>
         <w:rPr>
           <w:rFonts w:ascii="Arial" w:hAnsi="Arial" w:cs="Arial"/>
-          <w:lang w:val="en-US"/>
-        </w:rPr>
-      </w:pPr>
-      <w:r>
-        <w:rPr>
-          <w:rFonts w:ascii="Arial" w:hAnsi="Arial" w:cs="Arial"/>
-          <w:lang w:val="en-US"/>
+        </w:rPr>
+      </w:pPr>
+      <w:r>
+        <w:rPr>
+          <w:rFonts w:ascii="Arial" w:hAnsi="Arial" w:cs="Arial"/>
         </w:rPr>
         <w:t>A) "file"</w:t>
       </w:r>
@@ -4825,13 +5422,11 @@
         <w:ind w:left="400"/>
         <w:rPr>
           <w:rFonts w:ascii="Arial" w:hAnsi="Arial" w:cs="Arial"/>
-          <w:lang w:val="en-US"/>
-        </w:rPr>
-      </w:pPr>
-      <w:r>
-        <w:rPr>
-          <w:rFonts w:ascii="Arial" w:hAnsi="Arial" w:cs="Arial"/>
-          <w:lang w:val="en-US"/>
+        </w:rPr>
+      </w:pPr>
+      <w:r>
+        <w:rPr>
+          <w:rFonts w:ascii="Arial" w:hAnsi="Arial" w:cs="Arial"/>
         </w:rPr>
         <w:t>B) "pdf"</w:t>
       </w:r>
@@ -4842,15 +5437,30 @@
         <w:ind w:left="400"/>
         <w:rPr>
           <w:rFonts w:ascii="Arial" w:hAnsi="Arial" w:cs="Arial"/>
-          <w:lang w:val="en-US"/>
-        </w:rPr>
-      </w:pPr>
-      <w:r>
-        <w:rPr>
-          <w:rFonts w:ascii="Arial" w:hAnsi="Arial" w:cs="Arial"/>
-          <w:lang w:val="en-US"/>
-        </w:rPr>
-        <w:t>C) "document"</w:t>
+        </w:rPr>
+      </w:pPr>
+      <w:r>
+        <w:rPr>
+          <w:rFonts w:ascii="Arial" w:hAnsi="Arial" w:cs="Arial"/>
+          <w:highlight w:val="yellow"/>
+        </w:rPr>
+        <w:t>C) "</w:t>
+      </w:r>
+      <w:proofErr w:type="spellStart"/>
+      <w:r>
+        <w:rPr>
+          <w:rFonts w:ascii="Arial" w:hAnsi="Arial" w:cs="Arial"/>
+          <w:highlight w:val="yellow"/>
+        </w:rPr>
+        <w:t>document</w:t>
+      </w:r>
+      <w:proofErr w:type="spellEnd"/>
+      <w:r>
+        <w:rPr>
+          <w:rFonts w:ascii="Arial" w:hAnsi="Arial" w:cs="Arial"/>
+          <w:highlight w:val="yellow"/>
+        </w:rPr>
+        <w:t>"</w:t>
       </w:r>
     </w:p>
     <w:p>
@@ -4952,6 +5562,7 @@
       <w:r>
         <w:rPr>
           <w:rFonts w:ascii="Arial" w:hAnsi="Arial" w:cs="Arial"/>
+          <w:highlight w:val="yellow"/>
           <w:lang w:val="en-US"/>
         </w:rPr>
         <w:t>C) "application/pdf"</w:t>
@@ -5038,6 +5649,7 @@
       <w:r>
         <w:rPr>
           <w:rFonts w:ascii="Arial" w:hAnsi="Arial" w:cs="Arial"/>
+          <w:highlight w:val="yellow"/>
           <w:lang w:val="en-US"/>
         </w:rPr>
         <w:t>B) Images, charts, tables, and overall document structure</w:t>
@@ -5109,24 +5721,94 @@
           <w:bCs/>
           <w:lang w:val="en-US"/>
         </w:rPr>
-        <w:t>5. Why was the variable renamed from image_bytes to file_bytes in the PDF example?</w:t>
-      </w:r>
-    </w:p>
-    <w:p>
-      <w:pPr>
-        <w:spacing w:after="60" w:line="300" w:lineRule="auto"/>
-        <w:ind w:left="400"/>
-        <w:rPr>
-          <w:rFonts w:ascii="Arial" w:hAnsi="Arial" w:cs="Arial"/>
-          <w:lang w:val="en-US"/>
-        </w:rPr>
-      </w:pPr>
-      <w:r>
-        <w:rPr>
-          <w:rFonts w:ascii="Arial" w:hAnsi="Arial" w:cs="Arial"/>
-          <w:lang w:val="en-US"/>
-        </w:rPr>
-        <w:t>A) Because image_bytes is a reserved keyword in Python</w:t>
+        <w:t xml:space="preserve">5. </w:t>
+      </w:r>
+      <w:r>
+        <w:rPr>
+          <w:rFonts w:ascii="Arial" w:hAnsi="Arial" w:cs="Arial"/>
+          <w:b/>
+          <w:bCs/>
+          <w:color w:val="EE0000"/>
+          <w:lang w:val="en-US"/>
+        </w:rPr>
+        <w:t xml:space="preserve">Why was the variable renamed from </w:t>
+      </w:r>
+      <w:proofErr w:type="spellStart"/>
+      <w:r>
+        <w:rPr>
+          <w:rFonts w:ascii="Arial" w:hAnsi="Arial" w:cs="Arial"/>
+          <w:b/>
+          <w:bCs/>
+          <w:color w:val="EE0000"/>
+          <w:lang w:val="en-US"/>
+        </w:rPr>
+        <w:t>image_bytes</w:t>
+      </w:r>
+      <w:proofErr w:type="spellEnd"/>
+      <w:r>
+        <w:rPr>
+          <w:rFonts w:ascii="Arial" w:hAnsi="Arial" w:cs="Arial"/>
+          <w:b/>
+          <w:bCs/>
+          <w:color w:val="EE0000"/>
+          <w:lang w:val="en-US"/>
+        </w:rPr>
+        <w:t xml:space="preserve"> to </w:t>
+      </w:r>
+      <w:proofErr w:type="spellStart"/>
+      <w:r>
+        <w:rPr>
+          <w:rFonts w:ascii="Arial" w:hAnsi="Arial" w:cs="Arial"/>
+          <w:b/>
+          <w:bCs/>
+          <w:color w:val="EE0000"/>
+          <w:lang w:val="en-US"/>
+        </w:rPr>
+        <w:t>file_bytes</w:t>
+      </w:r>
+      <w:proofErr w:type="spellEnd"/>
+      <w:r>
+        <w:rPr>
+          <w:rFonts w:ascii="Arial" w:hAnsi="Arial" w:cs="Arial"/>
+          <w:b/>
+          <w:bCs/>
+          <w:color w:val="EE0000"/>
+          <w:lang w:val="en-US"/>
+        </w:rPr>
+        <w:t xml:space="preserve"> in the PDF example?</w:t>
+      </w:r>
+    </w:p>
+    <w:p>
+      <w:pPr>
+        <w:spacing w:after="60" w:line="300" w:lineRule="auto"/>
+        <w:ind w:left="400"/>
+        <w:rPr>
+          <w:rFonts w:ascii="Arial" w:hAnsi="Arial" w:cs="Arial"/>
+          <w:lang w:val="en-US"/>
+        </w:rPr>
+      </w:pPr>
+      <w:r>
+        <w:rPr>
+          <w:rFonts w:ascii="Arial" w:hAnsi="Arial" w:cs="Arial"/>
+          <w:lang w:val="en-US"/>
+        </w:rPr>
+        <w:t xml:space="preserve">A) Because </w:t>
+      </w:r>
+      <w:proofErr w:type="spellStart"/>
+      <w:r>
+        <w:rPr>
+          <w:rFonts w:ascii="Arial" w:hAnsi="Arial" w:cs="Arial"/>
+          <w:lang w:val="en-US"/>
+        </w:rPr>
+        <w:t>image_bytes</w:t>
+      </w:r>
+      <w:proofErr w:type="spellEnd"/>
+      <w:r>
+        <w:rPr>
+          <w:rFonts w:ascii="Arial" w:hAnsi="Arial" w:cs="Arial"/>
+          <w:lang w:val="en-US"/>
+        </w:rPr>
+        <w:t xml:space="preserve"> is a reserved keyword in Python</w:t>
       </w:r>
     </w:p>
     <w:p>
@@ -5177,7 +5859,23 @@
           <w:rFonts w:ascii="Arial" w:hAnsi="Arial" w:cs="Arial"/>
           <w:lang w:val="en-US"/>
         </w:rPr>
-        <w:t>D) Because file_bytes triggers a different encoding automatically</w:t>
+        <w:t xml:space="preserve">D) Because </w:t>
+      </w:r>
+      <w:proofErr w:type="spellStart"/>
+      <w:r>
+        <w:rPr>
+          <w:rFonts w:ascii="Arial" w:hAnsi="Arial" w:cs="Arial"/>
+          <w:lang w:val="en-US"/>
+        </w:rPr>
+        <w:t>file_bytes</w:t>
+      </w:r>
+      <w:proofErr w:type="spellEnd"/>
+      <w:r>
+        <w:rPr>
+          <w:rFonts w:ascii="Arial" w:hAnsi="Arial" w:cs="Arial"/>
+          <w:lang w:val="en-US"/>
+        </w:rPr>
+        <w:t xml:space="preserve"> triggers a different encoding automatically</w:t>
       </w:r>
     </w:p>
     <w:p>
@@ -5423,7 +6121,27 @@
           <w:szCs w:val="20"/>
           <w:lang w:val="en-US"/>
         </w:rPr>
-        <w:t xml:space="preserve">        "media_type": "application/pdf",</w:t>
+        <w:t xml:space="preserve">        "</w:t>
+      </w:r>
+      <w:proofErr w:type="gramStart"/>
+      <w:r>
+        <w:rPr>
+          <w:rFonts w:ascii="Consolas" w:hAnsi="Consolas" w:cs="Consolas"/>
+          <w:sz w:val="20"/>
+          <w:szCs w:val="20"/>
+          <w:lang w:val="en-US"/>
+        </w:rPr>
+        <w:t>media</w:t>
+      </w:r>
+      <w:proofErr w:type="gramEnd"/>
+      <w:r>
+        <w:rPr>
+          <w:rFonts w:ascii="Consolas" w:hAnsi="Consolas" w:cs="Consolas"/>
+          <w:sz w:val="20"/>
+          <w:szCs w:val="20"/>
+          <w:lang w:val="en-US"/>
+        </w:rPr>
+        <w:t>_type": "application/pdf",</w:t>
       </w:r>
     </w:p>
     <w:p>
@@ -5444,7 +6162,27 @@
           <w:szCs w:val="20"/>
           <w:lang w:val="en-US"/>
         </w:rPr>
-        <w:t xml:space="preserve">        "data": file_bytes,</w:t>
+        <w:t xml:space="preserve">        "data": </w:t>
+      </w:r>
+      <w:proofErr w:type="spellStart"/>
+      <w:r>
+        <w:rPr>
+          <w:rFonts w:ascii="Consolas" w:hAnsi="Consolas" w:cs="Consolas"/>
+          <w:sz w:val="20"/>
+          <w:szCs w:val="20"/>
+          <w:lang w:val="en-US"/>
+        </w:rPr>
+        <w:t>file_bytes</w:t>
+      </w:r>
+      <w:proofErr w:type="spellEnd"/>
+      <w:r>
+        <w:rPr>
+          <w:rFonts w:ascii="Consolas" w:hAnsi="Consolas" w:cs="Consolas"/>
+          <w:sz w:val="20"/>
+          <w:szCs w:val="20"/>
+          <w:lang w:val="en-US"/>
+        </w:rPr>
+        <w:t>,</w:t>
       </w:r>
     </w:p>
     <w:p>
@@ -5507,7 +6245,34 @@
           <w:szCs w:val="20"/>
           <w:lang w:val="en-US"/>
         </w:rPr>
-        <w:t xml:space="preserve">    "citations": { "enabled": True }</w:t>
+        <w:t xml:space="preserve">    "citations": </w:t>
+      </w:r>
+      <w:r>
+        <w:rPr>
+          <w:rFonts w:ascii="Consolas" w:hAnsi="Consolas" w:cs="Consolas"/>
+          <w:sz w:val="20"/>
+          <w:szCs w:val="20"/>
+          <w:lang w:val="en-US"/>
+        </w:rPr>
+        <w:t>{ "</w:t>
+      </w:r>
+      <w:r>
+        <w:rPr>
+          <w:rFonts w:ascii="Consolas" w:hAnsi="Consolas" w:cs="Consolas"/>
+          <w:sz w:val="20"/>
+          <w:szCs w:val="20"/>
+          <w:lang w:val="en-US"/>
+        </w:rPr>
+        <w:t xml:space="preserve">enabled": </w:t>
+      </w:r>
+      <w:r>
+        <w:rPr>
+          <w:rFonts w:ascii="Consolas" w:hAnsi="Consolas" w:cs="Consolas"/>
+          <w:sz w:val="20"/>
+          <w:szCs w:val="20"/>
+          <w:lang w:val="en-US"/>
+        </w:rPr>
+        <w:t>True }</w:t>
       </w:r>
     </w:p>
     <w:p>
@@ -5562,7 +6327,77 @@
         <w:rPr>
           <w:lang w:val="en-US"/>
         </w:rPr>
-        <w:t>With citations enabled, the response becomes structured data: each claim carries a citation with several fields — cited_text (the exact source text supporting the statement), document_index (which document, when multiple are provided), document_title, and start_page_number / end_page_number marking where the cited text begins and ends.</w:t>
+        <w:t xml:space="preserve">With citations enabled, the response becomes structured data: each claim carries a citation with several fields — </w:t>
+      </w:r>
+      <w:proofErr w:type="spellStart"/>
+      <w:r>
+        <w:rPr>
+          <w:lang w:val="en-US"/>
+        </w:rPr>
+        <w:t>cited_text</w:t>
+      </w:r>
+      <w:proofErr w:type="spellEnd"/>
+      <w:r>
+        <w:rPr>
+          <w:lang w:val="en-US"/>
+        </w:rPr>
+        <w:t xml:space="preserve"> (the exact source text supporting the statement), document_index (which document, when multiple </w:t>
+      </w:r>
+      <w:proofErr w:type="gramStart"/>
+      <w:r>
+        <w:rPr>
+          <w:lang w:val="en-US"/>
+        </w:rPr>
+        <w:t>are</w:t>
+      </w:r>
+      <w:proofErr w:type="gramEnd"/>
+      <w:r>
+        <w:rPr>
+          <w:lang w:val="en-US"/>
+        </w:rPr>
+        <w:t xml:space="preserve"> provided), </w:t>
+      </w:r>
+      <w:proofErr w:type="spellStart"/>
+      <w:r>
+        <w:rPr>
+          <w:lang w:val="en-US"/>
+        </w:rPr>
+        <w:t>document_title</w:t>
+      </w:r>
+      <w:proofErr w:type="spellEnd"/>
+      <w:r>
+        <w:rPr>
+          <w:lang w:val="en-US"/>
+        </w:rPr>
+        <w:t xml:space="preserve">, and </w:t>
+      </w:r>
+      <w:proofErr w:type="spellStart"/>
+      <w:r>
+        <w:rPr>
+          <w:lang w:val="en-US"/>
+        </w:rPr>
+        <w:t>start_page_number</w:t>
+      </w:r>
+      <w:proofErr w:type="spellEnd"/>
+      <w:r>
+        <w:rPr>
+          <w:lang w:val="en-US"/>
+        </w:rPr>
+        <w:t xml:space="preserve"> / </w:t>
+      </w:r>
+      <w:proofErr w:type="spellStart"/>
+      <w:r>
+        <w:rPr>
+          <w:lang w:val="en-US"/>
+        </w:rPr>
+        <w:t>end_page_number</w:t>
+      </w:r>
+      <w:proofErr w:type="spellEnd"/>
+      <w:r>
+        <w:rPr>
+          <w:lang w:val="en-US"/>
+        </w:rPr>
+        <w:t xml:space="preserve"> marking where the cited text begins and ends.</w:t>
       </w:r>
     </w:p>
     <w:p>
@@ -5632,7 +6467,103 @@
           <w:szCs w:val="20"/>
           <w:lang w:val="en-US"/>
         </w:rPr>
-        <w:t>The five citation fields, with an example drawn from the earth.pdf document: cited_text, document_index, document_title, start_page_number, and end_page_number.</w:t>
+        <w:t xml:space="preserve">The five citation fields, with an example drawn from the earth.pdf document: </w:t>
+      </w:r>
+      <w:proofErr w:type="spellStart"/>
+      <w:r>
+        <w:rPr>
+          <w:i/>
+          <w:iCs/>
+          <w:color w:val="888888"/>
+          <w:sz w:val="20"/>
+          <w:szCs w:val="20"/>
+          <w:lang w:val="en-US"/>
+        </w:rPr>
+        <w:t>cited_text</w:t>
+      </w:r>
+      <w:proofErr w:type="spellEnd"/>
+      <w:r>
+        <w:rPr>
+          <w:i/>
+          <w:iCs/>
+          <w:color w:val="888888"/>
+          <w:sz w:val="20"/>
+          <w:szCs w:val="20"/>
+          <w:lang w:val="en-US"/>
+        </w:rPr>
+        <w:t xml:space="preserve">, document_index, </w:t>
+      </w:r>
+      <w:proofErr w:type="spellStart"/>
+      <w:r>
+        <w:rPr>
+          <w:i/>
+          <w:iCs/>
+          <w:color w:val="888888"/>
+          <w:sz w:val="20"/>
+          <w:szCs w:val="20"/>
+          <w:lang w:val="en-US"/>
+        </w:rPr>
+        <w:t>document_title</w:t>
+      </w:r>
+      <w:proofErr w:type="spellEnd"/>
+      <w:r>
+        <w:rPr>
+          <w:i/>
+          <w:iCs/>
+          <w:color w:val="888888"/>
+          <w:sz w:val="20"/>
+          <w:szCs w:val="20"/>
+          <w:lang w:val="en-US"/>
+        </w:rPr>
+        <w:t xml:space="preserve">, </w:t>
+      </w:r>
+      <w:proofErr w:type="spellStart"/>
+      <w:r>
+        <w:rPr>
+          <w:i/>
+          <w:iCs/>
+          <w:color w:val="888888"/>
+          <w:sz w:val="20"/>
+          <w:szCs w:val="20"/>
+          <w:lang w:val="en-US"/>
+        </w:rPr>
+        <w:t>start_page_number</w:t>
+      </w:r>
+      <w:proofErr w:type="spellEnd"/>
+      <w:r>
+        <w:rPr>
+          <w:i/>
+          <w:iCs/>
+          <w:color w:val="888888"/>
+          <w:sz w:val="20"/>
+          <w:szCs w:val="20"/>
+          <w:lang w:val="en-US"/>
+        </w:rPr>
+        <w:t xml:space="preserve">, and </w:t>
+      </w:r>
+      <w:proofErr w:type="spellStart"/>
+      <w:r>
+        <w:rPr>
+          <w:i/>
+          <w:iCs/>
+          <w:color w:val="888888"/>
+          <w:sz w:val="20"/>
+          <w:szCs w:val="20"/>
+          <w:lang w:val="en-US"/>
+        </w:rPr>
+        <w:t>end_page_number</w:t>
+      </w:r>
+      <w:proofErr w:type="spellEnd"/>
+      <w:r>
+        <w:rPr>
+          <w:i/>
+          <w:iCs/>
+          <w:color w:val="888888"/>
+          <w:sz w:val="20"/>
+          <w:szCs w:val="20"/>
+          <w:lang w:val="en-US"/>
+        </w:rPr>
+        <w:t>.</w:t>
       </w:r>
     </w:p>
     <w:p>
@@ -5805,7 +6736,27 @@
           <w:szCs w:val="20"/>
           <w:lang w:val="en-US"/>
         </w:rPr>
-        <w:t xml:space="preserve">        "media_type": "text/plain",</w:t>
+        <w:t xml:space="preserve">        "</w:t>
+      </w:r>
+      <w:proofErr w:type="gramStart"/>
+      <w:r>
+        <w:rPr>
+          <w:rFonts w:ascii="Consolas" w:hAnsi="Consolas" w:cs="Consolas"/>
+          <w:sz w:val="20"/>
+          <w:szCs w:val="20"/>
+          <w:lang w:val="en-US"/>
+        </w:rPr>
+        <w:t>media</w:t>
+      </w:r>
+      <w:proofErr w:type="gramEnd"/>
+      <w:r>
+        <w:rPr>
+          <w:rFonts w:ascii="Consolas" w:hAnsi="Consolas" w:cs="Consolas"/>
+          <w:sz w:val="20"/>
+          <w:szCs w:val="20"/>
+          <w:lang w:val="en-US"/>
+        </w:rPr>
+        <w:t>_type": "text/plain",</w:t>
       </w:r>
     </w:p>
     <w:p>
@@ -5826,7 +6777,27 @@
           <w:szCs w:val="20"/>
           <w:lang w:val="en-US"/>
         </w:rPr>
-        <w:t xml:space="preserve">        "data": article_text,</w:t>
+        <w:t xml:space="preserve">        "data": </w:t>
+      </w:r>
+      <w:proofErr w:type="spellStart"/>
+      <w:r>
+        <w:rPr>
+          <w:rFonts w:ascii="Consolas" w:hAnsi="Consolas" w:cs="Consolas"/>
+          <w:sz w:val="20"/>
+          <w:szCs w:val="20"/>
+          <w:lang w:val="en-US"/>
+        </w:rPr>
+        <w:t>article_text</w:t>
+      </w:r>
+      <w:proofErr w:type="spellEnd"/>
+      <w:r>
+        <w:rPr>
+          <w:rFonts w:ascii="Consolas" w:hAnsi="Consolas" w:cs="Consolas"/>
+          <w:sz w:val="20"/>
+          <w:szCs w:val="20"/>
+          <w:lang w:val="en-US"/>
+        </w:rPr>
+        <w:t>,</w:t>
       </w:r>
     </w:p>
     <w:p>
@@ -5868,7 +6839,27 @@
           <w:szCs w:val="20"/>
           <w:lang w:val="en-US"/>
         </w:rPr>
-        <w:t xml:space="preserve">    "title": "earth_article",</w:t>
+        <w:t xml:space="preserve">    "title": "</w:t>
+      </w:r>
+      <w:proofErr w:type="spellStart"/>
+      <w:r>
+        <w:rPr>
+          <w:rFonts w:ascii="Consolas" w:hAnsi="Consolas" w:cs="Consolas"/>
+          <w:sz w:val="20"/>
+          <w:szCs w:val="20"/>
+          <w:lang w:val="en-US"/>
+        </w:rPr>
+        <w:t>earth_article</w:t>
+      </w:r>
+      <w:proofErr w:type="spellEnd"/>
+      <w:r>
+        <w:rPr>
+          <w:rFonts w:ascii="Consolas" w:hAnsi="Consolas" w:cs="Consolas"/>
+          <w:sz w:val="20"/>
+          <w:szCs w:val="20"/>
+          <w:lang w:val="en-US"/>
+        </w:rPr>
+        <w:t>",</w:t>
       </w:r>
     </w:p>
     <w:p>
@@ -5889,7 +6880,43 @@
           <w:szCs w:val="20"/>
           <w:lang w:val="en-US"/>
         </w:rPr>
-        <w:t xml:space="preserve">    "citations": { "enabled": True }</w:t>
+        <w:t xml:space="preserve">    "citations": </w:t>
+      </w:r>
+      <w:r>
+        <w:rPr>
+          <w:rFonts w:ascii="Consolas" w:hAnsi="Consolas" w:cs="Consolas"/>
+          <w:sz w:val="20"/>
+          <w:szCs w:val="20"/>
+          <w:lang w:val="en-US"/>
+        </w:rPr>
+        <w:t>{ "</w:t>
+      </w:r>
+      <w:r>
+        <w:rPr>
+          <w:rFonts w:ascii="Consolas" w:hAnsi="Consolas" w:cs="Consolas"/>
+          <w:sz w:val="20"/>
+          <w:szCs w:val="20"/>
+          <w:lang w:val="en-US"/>
+        </w:rPr>
+        <w:t xml:space="preserve">enabled": </w:t>
+      </w:r>
+      <w:r>
+        <w:rPr>
+          <w:rFonts w:ascii="Consolas" w:hAnsi="Consolas" w:cs="Consolas"/>
+          <w:sz w:val="20"/>
+          <w:szCs w:val="20"/>
+          <w:lang w:val="en-US"/>
+        </w:rPr>
+        <w:t>Tru</w:t>
+      </w:r>
+      <w:r>
+        <w:rPr>
+          <w:rFonts w:ascii="Consolas" w:hAnsi="Consolas" w:cs="Consolas"/>
+          <w:sz w:val="20"/>
+          <w:szCs w:val="20"/>
+          <w:lang w:val="en-US"/>
+        </w:rPr>
+        <w:t>e }</w:t>
       </w:r>
     </w:p>
     <w:p>
@@ -6127,6 +7154,7 @@
       <w:r>
         <w:rPr>
           <w:rFonts w:ascii="Arial" w:hAnsi="Arial" w:cs="Arial"/>
+          <w:highlight w:val="yellow"/>
           <w:lang w:val="en-US"/>
         </w:rPr>
         <w:t>B) They let users verify that an answer is actually grounded in the provided source document</w:t>
@@ -6247,6 +7275,7 @@
       <w:r>
         <w:rPr>
           <w:rFonts w:ascii="Arial" w:hAnsi="Arial" w:cs="Arial"/>
+          <w:highlight w:val="yellow"/>
           <w:lang w:val="en-US"/>
         </w:rPr>
         <w:t>C) "title" and "citations": {"enabled": True}</w:t>
@@ -6333,6 +7362,7 @@
       <w:r>
         <w:rPr>
           <w:rFonts w:ascii="Arial" w:hAnsi="Arial" w:cs="Arial"/>
+          <w:highlight w:val="yellow"/>
           <w:lang w:val="en-US"/>
         </w:rPr>
         <w:t>B) Which document Claude is citing from, when multiple documents are provided</w:t>
@@ -6437,6 +7467,7 @@
       <w:r>
         <w:rPr>
           <w:rFonts w:ascii="Arial" w:hAnsi="Arial" w:cs="Arial"/>
+          <w:highlight w:val="yellow"/>
           <w:lang w:val="en-US"/>
         </w:rPr>
         <w:t>B) Character positions within the text</w:t>
@@ -6540,6 +7571,7 @@
       <w:r>
         <w:rPr>
           <w:rFonts w:ascii="Arial" w:hAnsi="Arial" w:cs="Arial"/>
+          <w:highlight w:val="yellow"/>
           <w:lang w:val="en-US"/>
         </w:rPr>
         <w:t>B) When users need to verify accuracy, work with authoritative sources, or need transparency and deeper context</w:t>
@@ -7503,6 +8535,7 @@
       <w:r>
         <w:rPr>
           <w:rFonts w:ascii="Arial" w:hAnsi="Arial" w:cs="Arial"/>
+          <w:highlight w:val="yellow"/>
           <w:lang w:val="en-US"/>
         </w:rPr>
         <w:t>B) It is discarded after the response is sent</w:t>
@@ -7606,6 +8639,7 @@
       <w:r>
         <w:rPr>
           <w:rFonts w:ascii="Arial" w:hAnsi="Arial" w:cs="Arial"/>
+          <w:highlight w:val="yellow"/>
           <w:lang w:val="en-US"/>
         </w:rPr>
         <w:t>B) It saves the preprocessing results in a cache instead of discarding them</w:t>
@@ -7667,14 +8701,16 @@
         <w:spacing w:before="200" w:after="100" w:line="300" w:lineRule="auto"/>
         <w:rPr>
           <w:rFonts w:ascii="Arial" w:hAnsi="Arial" w:cs="Arial"/>
-          <w:lang w:val="en-US"/>
-        </w:rPr>
-      </w:pPr>
-      <w:r>
-        <w:rPr>
-          <w:rFonts w:ascii="Arial" w:hAnsi="Arial" w:cs="Arial"/>
-          <w:b/>
-          <w:bCs/>
+          <w:color w:val="EE0000"/>
+          <w:lang w:val="en-US"/>
+        </w:rPr>
+      </w:pPr>
+      <w:r>
+        <w:rPr>
+          <w:rFonts w:ascii="Arial" w:hAnsi="Arial" w:cs="Arial"/>
+          <w:b/>
+          <w:bCs/>
+          <w:color w:val="EE0000"/>
           <w:lang w:val="en-US"/>
         </w:rPr>
         <w:t>3. How long does cached content live before it expires?</w:t>
@@ -7709,6 +8745,7 @@
       <w:r>
         <w:rPr>
           <w:rFonts w:ascii="Arial" w:hAnsi="Arial" w:cs="Arial"/>
+          <w:highlight w:val="yellow"/>
           <w:lang w:val="en-US"/>
         </w:rPr>
         <w:t>B) 1 hour</w:t>
@@ -7829,6 +8866,7 @@
       <w:r>
         <w:rPr>
           <w:rFonts w:ascii="Arial" w:hAnsi="Arial" w:cs="Arial"/>
+          <w:highlight w:val="yellow"/>
           <w:lang w:val="en-US"/>
         </w:rPr>
         <w:t>C) Asking multiple questions about the same large document</w:t>
@@ -7915,6 +8953,7 @@
       <w:r>
         <w:rPr>
           <w:rFonts w:ascii="Arial" w:hAnsi="Arial" w:cs="Arial"/>
+          <w:highlight w:val="yellow"/>
           <w:lang w:val="en-US"/>
         </w:rPr>
         <w:t>B) Faster responses and lower costs on cached content</w:t>
@@ -8937,6 +9976,7 @@
       <w:r>
         <w:rPr>
           <w:rFonts w:ascii="Arial" w:hAnsi="Arial" w:cs="Arial"/>
+          <w:highlight w:val="yellow"/>
           <w:lang w:val="en-US"/>
         </w:rPr>
         <w:t>B) No, a cache breakpoint must be manually added to a block</w:t>
@@ -8998,14 +10038,16 @@
         <w:spacing w:before="200" w:after="100" w:line="300" w:lineRule="auto"/>
         <w:rPr>
           <w:rFonts w:ascii="Arial" w:hAnsi="Arial" w:cs="Arial"/>
-          <w:lang w:val="en-US"/>
-        </w:rPr>
-      </w:pPr>
-      <w:r>
-        <w:rPr>
-          <w:rFonts w:ascii="Arial" w:hAnsi="Arial" w:cs="Arial"/>
-          <w:b/>
-          <w:bCs/>
+          <w:color w:val="EE0000"/>
+          <w:lang w:val="en-US"/>
+        </w:rPr>
+      </w:pPr>
+      <w:r>
+        <w:rPr>
+          <w:rFonts w:ascii="Arial" w:hAnsi="Arial" w:cs="Arial"/>
+          <w:b/>
+          <w:bCs/>
+          <w:color w:val="EE0000"/>
           <w:lang w:val="en-US"/>
         </w:rPr>
         <w:t>2. Why is the longhand form required when adding a cache breakpoint to a text block?</w:t>
@@ -9143,6 +10185,7 @@
       <w:r>
         <w:rPr>
           <w:rFonts w:ascii="Arial" w:hAnsi="Arial" w:cs="Arial"/>
+          <w:highlight w:val="yellow"/>
           <w:lang w:val="en-US"/>
         </w:rPr>
         <w:t>B) The cache is invalidated and Claude reprocesses everything up to the breakpoint</w:t>
@@ -9246,6 +10289,7 @@
       <w:r>
         <w:rPr>
           <w:rFonts w:ascii="Arial" w:hAnsi="Arial" w:cs="Arial"/>
+          <w:highlight w:val="yellow"/>
           <w:lang w:val="en-US"/>
         </w:rPr>
         <w:t>B) System prompts, tool definitions, image blocks, and tool use/result blocks</w:t>
@@ -9367,6 +10411,7 @@
       <w:r>
         <w:rPr>
           <w:rFonts w:ascii="Arial" w:hAnsi="Arial" w:cs="Arial"/>
+          <w:highlight w:val="yellow"/>
           <w:lang w:val="en-US"/>
         </w:rPr>
         <w:t>C) 1024 tokens</w:t>
@@ -9453,6 +10498,7 @@
       <w:r>
         <w:rPr>
           <w:rFonts w:ascii="Arial" w:hAnsi="Arial" w:cs="Arial"/>
+          <w:highlight w:val="yellow"/>
           <w:lang w:val="en-US"/>
         </w:rPr>
         <w:t>B) Up to four breakpoints; tools are processed first, then system prompt, then messages</w:t>
@@ -9638,7 +10684,49 @@
           <w:szCs w:val="20"/>
           <w:lang w:val="en-US"/>
         </w:rPr>
-        <w:t xml:space="preserve">    tools_clone = tools.copy()</w:t>
+        <w:t xml:space="preserve">    </w:t>
+      </w:r>
+      <w:proofErr w:type="spellStart"/>
+      <w:r>
+        <w:rPr>
+          <w:rFonts w:ascii="Consolas" w:hAnsi="Consolas" w:cs="Consolas"/>
+          <w:sz w:val="20"/>
+          <w:szCs w:val="20"/>
+          <w:lang w:val="en-US"/>
+        </w:rPr>
+        <w:t>tools_clone</w:t>
+      </w:r>
+      <w:proofErr w:type="spellEnd"/>
+      <w:r>
+        <w:rPr>
+          <w:rFonts w:ascii="Consolas" w:hAnsi="Consolas" w:cs="Consolas"/>
+          <w:sz w:val="20"/>
+          <w:szCs w:val="20"/>
+          <w:lang w:val="en-US"/>
+        </w:rPr>
+        <w:t xml:space="preserve"> = </w:t>
+      </w:r>
+      <w:proofErr w:type="spellStart"/>
+      <w:proofErr w:type="gramStart"/>
+      <w:r>
+        <w:rPr>
+          <w:rFonts w:ascii="Consolas" w:hAnsi="Consolas" w:cs="Consolas"/>
+          <w:sz w:val="20"/>
+          <w:szCs w:val="20"/>
+          <w:lang w:val="en-US"/>
+        </w:rPr>
+        <w:t>tools.copy</w:t>
+      </w:r>
+      <w:proofErr w:type="spellEnd"/>
+      <w:proofErr w:type="gramEnd"/>
+      <w:r>
+        <w:rPr>
+          <w:rFonts w:ascii="Consolas" w:hAnsi="Consolas" w:cs="Consolas"/>
+          <w:sz w:val="20"/>
+          <w:szCs w:val="20"/>
+          <w:lang w:val="en-US"/>
+        </w:rPr>
+        <w:t>()</w:t>
       </w:r>
     </w:p>
     <w:p>
@@ -9659,7 +10747,67 @@
           <w:szCs w:val="20"/>
           <w:lang w:val="en-US"/>
         </w:rPr>
-        <w:t xml:space="preserve">    last_tool = tools_clone[-1].copy()</w:t>
+        <w:t xml:space="preserve">    </w:t>
+      </w:r>
+      <w:proofErr w:type="spellStart"/>
+      <w:r>
+        <w:rPr>
+          <w:rFonts w:ascii="Consolas" w:hAnsi="Consolas" w:cs="Consolas"/>
+          <w:sz w:val="20"/>
+          <w:szCs w:val="20"/>
+          <w:lang w:val="en-US"/>
+        </w:rPr>
+        <w:t>last_tool</w:t>
+      </w:r>
+      <w:proofErr w:type="spellEnd"/>
+      <w:r>
+        <w:rPr>
+          <w:rFonts w:ascii="Consolas" w:hAnsi="Consolas" w:cs="Consolas"/>
+          <w:sz w:val="20"/>
+          <w:szCs w:val="20"/>
+          <w:lang w:val="en-US"/>
+        </w:rPr>
+        <w:t xml:space="preserve"> = </w:t>
+      </w:r>
+      <w:proofErr w:type="spellStart"/>
+      <w:r>
+        <w:rPr>
+          <w:rFonts w:ascii="Consolas" w:hAnsi="Consolas" w:cs="Consolas"/>
+          <w:sz w:val="20"/>
+          <w:szCs w:val="20"/>
+          <w:lang w:val="en-US"/>
+        </w:rPr>
+        <w:t>tools_clone</w:t>
+      </w:r>
+      <w:proofErr w:type="spellEnd"/>
+      <w:r>
+        <w:rPr>
+          <w:rFonts w:ascii="Consolas" w:hAnsi="Consolas" w:cs="Consolas"/>
+          <w:sz w:val="20"/>
+          <w:szCs w:val="20"/>
+          <w:lang w:val="en-US"/>
+        </w:rPr>
+        <w:t>[-1</w:t>
+      </w:r>
+      <w:proofErr w:type="gramStart"/>
+      <w:r>
+        <w:rPr>
+          <w:rFonts w:ascii="Consolas" w:hAnsi="Consolas" w:cs="Consolas"/>
+          <w:sz w:val="20"/>
+          <w:szCs w:val="20"/>
+          <w:lang w:val="en-US"/>
+        </w:rPr>
+        <w:t>].copy</w:t>
+      </w:r>
+      <w:proofErr w:type="gramEnd"/>
+      <w:r>
+        <w:rPr>
+          <w:rFonts w:ascii="Consolas" w:hAnsi="Consolas" w:cs="Consolas"/>
+          <w:sz w:val="20"/>
+          <w:szCs w:val="20"/>
+          <w:lang w:val="en-US"/>
+        </w:rPr>
+        <w:t>()</w:t>
       </w:r>
     </w:p>
     <w:p>
@@ -9680,7 +10828,27 @@
           <w:szCs w:val="20"/>
           <w:lang w:val="en-US"/>
         </w:rPr>
-        <w:t xml:space="preserve">    last_tool["cache_control"] = {"type": "ephemeral"}</w:t>
+        <w:t xml:space="preserve">    </w:t>
+      </w:r>
+      <w:proofErr w:type="spellStart"/>
+      <w:r>
+        <w:rPr>
+          <w:rFonts w:ascii="Consolas" w:hAnsi="Consolas" w:cs="Consolas"/>
+          <w:sz w:val="20"/>
+          <w:szCs w:val="20"/>
+          <w:lang w:val="en-US"/>
+        </w:rPr>
+        <w:t>last_tool</w:t>
+      </w:r>
+      <w:proofErr w:type="spellEnd"/>
+      <w:r>
+        <w:rPr>
+          <w:rFonts w:ascii="Consolas" w:hAnsi="Consolas" w:cs="Consolas"/>
+          <w:sz w:val="20"/>
+          <w:szCs w:val="20"/>
+          <w:lang w:val="en-US"/>
+        </w:rPr>
+        <w:t>["cache_control"] = {"type": "ephemeral"}</w:t>
       </w:r>
     </w:p>
     <w:p>
@@ -9701,8 +10869,59 @@
           <w:szCs w:val="20"/>
           <w:lang w:val="en-US"/>
         </w:rPr>
-        <w:t xml:space="preserve">    tools_clone[-1] = last_tool</w:t>
-      </w:r>
+        <w:t xml:space="preserve">    </w:t>
+      </w:r>
+      <w:proofErr w:type="spellStart"/>
+      <w:r>
+        <w:rPr>
+          <w:rFonts w:ascii="Consolas" w:hAnsi="Consolas" w:cs="Consolas"/>
+          <w:sz w:val="20"/>
+          <w:szCs w:val="20"/>
+          <w:lang w:val="en-US"/>
+        </w:rPr>
+        <w:t>tools_</w:t>
+      </w:r>
+      <w:proofErr w:type="gramStart"/>
+      <w:r>
+        <w:rPr>
+          <w:rFonts w:ascii="Consolas" w:hAnsi="Consolas" w:cs="Consolas"/>
+          <w:sz w:val="20"/>
+          <w:szCs w:val="20"/>
+          <w:lang w:val="en-US"/>
+        </w:rPr>
+        <w:t>clone</w:t>
+      </w:r>
+      <w:proofErr w:type="spellEnd"/>
+      <w:r>
+        <w:rPr>
+          <w:rFonts w:ascii="Consolas" w:hAnsi="Consolas" w:cs="Consolas"/>
+          <w:sz w:val="20"/>
+          <w:szCs w:val="20"/>
+          <w:lang w:val="en-US"/>
+        </w:rPr>
+        <w:t>[</w:t>
+      </w:r>
+      <w:proofErr w:type="gramEnd"/>
+      <w:r>
+        <w:rPr>
+          <w:rFonts w:ascii="Consolas" w:hAnsi="Consolas" w:cs="Consolas"/>
+          <w:sz w:val="20"/>
+          <w:szCs w:val="20"/>
+          <w:lang w:val="en-US"/>
+        </w:rPr>
+        <w:t xml:space="preserve">-1] = </w:t>
+      </w:r>
+      <w:proofErr w:type="spellStart"/>
+      <w:r>
+        <w:rPr>
+          <w:rFonts w:ascii="Consolas" w:hAnsi="Consolas" w:cs="Consolas"/>
+          <w:sz w:val="20"/>
+          <w:szCs w:val="20"/>
+          <w:lang w:val="en-US"/>
+        </w:rPr>
+        <w:t>last_tool</w:t>
+      </w:r>
+      <w:proofErr w:type="spellEnd"/>
     </w:p>
     <w:p>
       <w:pPr>
@@ -9722,8 +10941,19 @@
           <w:szCs w:val="20"/>
           <w:lang w:val="en-US"/>
         </w:rPr>
-        <w:t xml:space="preserve">    params["tools"] = tools_clone</w:t>
-      </w:r>
+        <w:t xml:space="preserve">    params["tools"] = </w:t>
+      </w:r>
+      <w:proofErr w:type="spellStart"/>
+      <w:r>
+        <w:rPr>
+          <w:rFonts w:ascii="Consolas" w:hAnsi="Consolas" w:cs="Consolas"/>
+          <w:sz w:val="20"/>
+          <w:szCs w:val="20"/>
+          <w:lang w:val="en-US"/>
+        </w:rPr>
+        <w:t>tools_clone</w:t>
+      </w:r>
+      <w:proofErr w:type="spellEnd"/>
     </w:p>
     <w:p>
       <w:pPr>
@@ -9736,7 +10966,21 @@
         <w:rPr>
           <w:lang w:val="en-US"/>
         </w:rPr>
-        <w:t>Directly modifying tools[-1]["cache_control"] would also work, but copying first avoids problems if the tools list gets reordered later.</w:t>
+        <w:t>Directly modifying tools[-</w:t>
+      </w:r>
+      <w:proofErr w:type="gramStart"/>
+      <w:r>
+        <w:rPr>
+          <w:lang w:val="en-US"/>
+        </w:rPr>
+        <w:t>1][</w:t>
+      </w:r>
+      <w:proofErr w:type="gramEnd"/>
+      <w:r>
+        <w:rPr>
+          <w:lang w:val="en-US"/>
+        </w:rPr>
+        <w:t>"cache_control"] would also work, but copying first avoids problems if the tools list gets reordered later.</w:t>
       </w:r>
     </w:p>
     <w:p>
@@ -9896,7 +11140,27 @@
           <w:szCs w:val="20"/>
           <w:lang w:val="en-US"/>
         </w:rPr>
-        <w:t xml:space="preserve">            "cache_control": {"type": "ephemeral"}</w:t>
+        <w:t xml:space="preserve">            "</w:t>
+      </w:r>
+      <w:proofErr w:type="gramStart"/>
+      <w:r>
+        <w:rPr>
+          <w:rFonts w:ascii="Consolas" w:hAnsi="Consolas" w:cs="Consolas"/>
+          <w:sz w:val="20"/>
+          <w:szCs w:val="20"/>
+          <w:lang w:val="en-US"/>
+        </w:rPr>
+        <w:t>cache</w:t>
+      </w:r>
+      <w:proofErr w:type="gramEnd"/>
+      <w:r>
+        <w:rPr>
+          <w:rFonts w:ascii="Consolas" w:hAnsi="Consolas" w:cs="Consolas"/>
+          <w:sz w:val="20"/>
+          <w:szCs w:val="20"/>
+          <w:lang w:val="en-US"/>
+        </w:rPr>
+        <w:t>_control": {"type": "ephemeral"}</w:t>
       </w:r>
     </w:p>
     <w:p>
@@ -10104,14 +11368,35 @@
       <w:pPr>
         <w:spacing w:after="140" w:line="300" w:lineRule="auto"/>
         <w:rPr>
-          <w:lang w:val="en-US"/>
-        </w:rPr>
-      </w:pPr>
-      <w:r>
-        <w:rPr>
-          <w:lang w:val="en-US"/>
-        </w:rPr>
-        <w:t>Multiple cache breakpoints can be set in one request, and the order in which components are cached matters: tools first, then system prompt, then messages. If the system prompt changes but the tools stay the same, the response shows a partial cache read for the tools plus a fresh cache write for the new system prompt — this granular caching means only the parts that actually changed get reprocessed and paid for.</w:t>
+          <w:highlight w:val="yellow"/>
+          <w:lang w:val="en-US"/>
+        </w:rPr>
+      </w:pPr>
+      <w:r>
+        <w:rPr>
+          <w:lang w:val="en-US"/>
+        </w:rPr>
+        <w:t xml:space="preserve">Multiple cache breakpoints can be set in one request, and the order in which components are cached matters: </w:t>
+      </w:r>
+      <w:r>
+        <w:rPr>
+          <w:highlight w:val="yellow"/>
+          <w:lang w:val="en-US"/>
+        </w:rPr>
+        <w:t>tools first, then system prompt, then messages.</w:t>
+      </w:r>
+      <w:r>
+        <w:rPr>
+          <w:lang w:val="en-US"/>
+        </w:rPr>
+        <w:t xml:space="preserve"> If the system prompt changes but the tools stay the same, the response shows a partial cache read for the tools plus a fresh cache write for the new system prompt — </w:t>
+      </w:r>
+      <w:r>
+        <w:rPr>
+          <w:highlight w:val="yellow"/>
+          <w:lang w:val="en-US"/>
+        </w:rPr>
+        <w:t>this granular caching means only the parts that actually changed get reprocessed and paid for.</w:t>
       </w:r>
     </w:p>
     <w:p>
@@ -10240,12 +11525,14 @@
         <w:ind w:left="400"/>
         <w:rPr>
           <w:rFonts w:ascii="Arial" w:hAnsi="Arial" w:cs="Arial"/>
-          <w:lang w:val="en-US"/>
-        </w:rPr>
-      </w:pPr>
-      <w:r>
-        <w:rPr>
-          <w:rFonts w:ascii="Arial" w:hAnsi="Arial" w:cs="Arial"/>
+          <w:highlight w:val="yellow"/>
+          <w:lang w:val="en-US"/>
+        </w:rPr>
+      </w:pPr>
+      <w:r>
+        <w:rPr>
+          <w:rFonts w:ascii="Arial" w:hAnsi="Arial" w:cs="Arial"/>
+          <w:highlight w:val="yellow"/>
           <w:lang w:val="en-US"/>
         </w:rPr>
         <w:t>C) On the last tool in the list</w:t>
@@ -10327,12 +11614,14 @@
         <w:ind w:left="400"/>
         <w:rPr>
           <w:rFonts w:ascii="Arial" w:hAnsi="Arial" w:cs="Arial"/>
-          <w:lang w:val="en-US"/>
-        </w:rPr>
-      </w:pPr>
-      <w:r>
-        <w:rPr>
-          <w:rFonts w:ascii="Arial" w:hAnsi="Arial" w:cs="Arial"/>
+          <w:highlight w:val="yellow"/>
+          <w:lang w:val="en-US"/>
+        </w:rPr>
+      </w:pPr>
+      <w:r>
+        <w:rPr>
+          <w:rFonts w:ascii="Arial" w:hAnsi="Arial" w:cs="Arial"/>
+          <w:highlight w:val="yellow"/>
           <w:lang w:val="en-US"/>
         </w:rPr>
         <w:t>B) It avoids mutating the original tool definitions and prevents issues if tools get reordered later</w:t>
@@ -10447,12 +11736,14 @@
         <w:ind w:left="400"/>
         <w:rPr>
           <w:rFonts w:ascii="Arial" w:hAnsi="Arial" w:cs="Arial"/>
-          <w:lang w:val="en-US"/>
-        </w:rPr>
-      </w:pPr>
-      <w:r>
-        <w:rPr>
-          <w:rFonts w:ascii="Arial" w:hAnsi="Arial" w:cs="Arial"/>
+          <w:highlight w:val="yellow"/>
+          <w:lang w:val="en-US"/>
+        </w:rPr>
+      </w:pPr>
+      <w:r>
+        <w:rPr>
+          <w:rFonts w:ascii="Arial" w:hAnsi="Arial" w:cs="Arial"/>
+          <w:highlight w:val="yellow"/>
           <w:lang w:val="en-US"/>
         </w:rPr>
         <w:t>C) It must become a list containing a text block with a cache_control field</w:t>
@@ -10533,12 +11824,14 @@
         <w:ind w:left="400"/>
         <w:rPr>
           <w:rFonts w:ascii="Arial" w:hAnsi="Arial" w:cs="Arial"/>
-          <w:lang w:val="en-US"/>
-        </w:rPr>
-      </w:pPr>
-      <w:r>
-        <w:rPr>
-          <w:rFonts w:ascii="Arial" w:hAnsi="Arial" w:cs="Arial"/>
+          <w:highlight w:val="yellow"/>
+          <w:lang w:val="en-US"/>
+        </w:rPr>
+      </w:pPr>
+      <w:r>
+        <w:rPr>
+          <w:rFonts w:ascii="Arial" w:hAnsi="Arial" w:cs="Arial"/>
+          <w:highlight w:val="yellow"/>
           <w:lang w:val="en-US"/>
         </w:rPr>
         <w:t>B) The number of tokens read back from the cache instead of being reprocessed</w:t>
@@ -10653,12 +11946,14 @@
         <w:ind w:left="400"/>
         <w:rPr>
           <w:rFonts w:ascii="Arial" w:hAnsi="Arial" w:cs="Arial"/>
-          <w:lang w:val="en-US"/>
-        </w:rPr>
-      </w:pPr>
-      <w:r>
-        <w:rPr>
-          <w:rFonts w:ascii="Arial" w:hAnsi="Arial" w:cs="Arial"/>
+          <w:highlight w:val="yellow"/>
+          <w:lang w:val="en-US"/>
+        </w:rPr>
+      </w:pPr>
+      <w:r>
+        <w:rPr>
+          <w:rFonts w:ascii="Arial" w:hAnsi="Arial" w:cs="Arial"/>
+          <w:highlight w:val="yellow"/>
           <w:lang w:val="en-US"/>
         </w:rPr>
         <w:t>C) A partial cache read for the tools plus a fresh cache write for the new system prompt</w:t>
@@ -10854,7 +12149,55 @@
           <w:szCs w:val="20"/>
           <w:lang w:val="en-US"/>
         </w:rPr>
-        <w:t>A file is uploaded once to get a FileMetadata object with a file ID; later messages reference that file_id inside an image block instead of raw base64 data.</w:t>
+        <w:t xml:space="preserve">A file is uploaded once to get a </w:t>
+      </w:r>
+      <w:proofErr w:type="spellStart"/>
+      <w:r>
+        <w:rPr>
+          <w:i/>
+          <w:iCs/>
+          <w:color w:val="888888"/>
+          <w:sz w:val="20"/>
+          <w:szCs w:val="20"/>
+          <w:lang w:val="en-US"/>
+        </w:rPr>
+        <w:t>FileMetadata</w:t>
+      </w:r>
+      <w:proofErr w:type="spellEnd"/>
+      <w:r>
+        <w:rPr>
+          <w:i/>
+          <w:iCs/>
+          <w:color w:val="888888"/>
+          <w:sz w:val="20"/>
+          <w:szCs w:val="20"/>
+          <w:lang w:val="en-US"/>
+        </w:rPr>
+        <w:t xml:space="preserve"> object with a file ID; later messages reference that </w:t>
+      </w:r>
+      <w:proofErr w:type="spellStart"/>
+      <w:r>
+        <w:rPr>
+          <w:i/>
+          <w:iCs/>
+          <w:color w:val="888888"/>
+          <w:sz w:val="20"/>
+          <w:szCs w:val="20"/>
+          <w:lang w:val="en-US"/>
+        </w:rPr>
+        <w:t>file_id</w:t>
+      </w:r>
+      <w:proofErr w:type="spellEnd"/>
+      <w:r>
+        <w:rPr>
+          <w:i/>
+          <w:iCs/>
+          <w:color w:val="888888"/>
+          <w:sz w:val="20"/>
+          <w:szCs w:val="20"/>
+          <w:lang w:val="en-US"/>
+        </w:rPr>
+        <w:t xml:space="preserve"> inside an image block instead of raw base64 data.</w:t>
       </w:r>
     </w:p>
     <w:p>
@@ -11104,7 +12447,21 @@
         <w:rPr>
           <w:lang w:val="en-US"/>
         </w:rPr>
-        <w:t>Since the Docker container has no network access, the Files API becomes the primary way to get data in and out of the execution environment. Typical workflow: upload a data file (e.g. a CSV) via the Files API, include a container_upload block with the file ID in the message, ask Claude to analyze the data, Claude writes and executes code against the file, and Claude can generate outputs (like plots) available for download.</w:t>
+        <w:t xml:space="preserve">Since the Docker container has no network access, the Files API becomes the primary way to get data in and out of the execution environment. Typical workflow: upload a data file (e.g. a CSV) via the Files API, include a </w:t>
+      </w:r>
+      <w:proofErr w:type="spellStart"/>
+      <w:r>
+        <w:rPr>
+          <w:lang w:val="en-US"/>
+        </w:rPr>
+        <w:t>container_upload</w:t>
+      </w:r>
+      <w:proofErr w:type="spellEnd"/>
+      <w:r>
+        <w:rPr>
+          <w:lang w:val="en-US"/>
+        </w:rPr>
+        <w:t xml:space="preserve"> block with the file ID in the message, ask Claude to analyze the data, Claude writes and executes code against the file, and Claude can generate outputs (like plots) available for download.</w:t>
       </w:r>
     </w:p>
     <w:p>
@@ -11173,7 +12530,31 @@
           <w:szCs w:val="20"/>
           <w:lang w:val="en-US"/>
         </w:rPr>
-        <w:t>A CSV is uploaded to get a file ID, referenced via a container_upload block; Claude executes code against it inside the container and reports the analysis results.</w:t>
+        <w:t xml:space="preserve">A CSV is uploaded to get a file ID, referenced via a </w:t>
+      </w:r>
+      <w:proofErr w:type="spellStart"/>
+      <w:r>
+        <w:rPr>
+          <w:i/>
+          <w:iCs/>
+          <w:color w:val="888888"/>
+          <w:sz w:val="20"/>
+          <w:szCs w:val="20"/>
+          <w:lang w:val="en-US"/>
+        </w:rPr>
+        <w:t>container_upload</w:t>
+      </w:r>
+      <w:proofErr w:type="spellEnd"/>
+      <w:r>
+        <w:rPr>
+          <w:i/>
+          <w:iCs/>
+          <w:color w:val="888888"/>
+          <w:sz w:val="20"/>
+          <w:szCs w:val="20"/>
+          <w:lang w:val="en-US"/>
+        </w:rPr>
+        <w:t xml:space="preserve"> block; Claude executes code against it inside the container and reports the analysis results.</w:t>
       </w:r>
     </w:p>
     <w:p>
@@ -11222,14 +12603,25 @@
           <w:lang w:val="en-US"/>
         </w:rPr>
       </w:pPr>
-      <w:r>
-        <w:rPr>
-          <w:rFonts w:ascii="Consolas" w:hAnsi="Consolas" w:cs="Consolas"/>
-          <w:sz w:val="20"/>
-          <w:szCs w:val="20"/>
-          <w:lang w:val="en-US"/>
-        </w:rPr>
-        <w:t>file_metadata = upload('streaming.csv')</w:t>
+      <w:proofErr w:type="spellStart"/>
+      <w:r>
+        <w:rPr>
+          <w:rFonts w:ascii="Consolas" w:hAnsi="Consolas" w:cs="Consolas"/>
+          <w:sz w:val="20"/>
+          <w:szCs w:val="20"/>
+          <w:lang w:val="en-US"/>
+        </w:rPr>
+        <w:t>file_metadata</w:t>
+      </w:r>
+      <w:proofErr w:type="spellEnd"/>
+      <w:r>
+        <w:rPr>
+          <w:rFonts w:ascii="Consolas" w:hAnsi="Consolas" w:cs="Consolas"/>
+          <w:sz w:val="20"/>
+          <w:szCs w:val="20"/>
+          <w:lang w:val="en-US"/>
+        </w:rPr>
+        <w:t xml:space="preserve"> = upload('streaming.csv')</w:t>
       </w:r>
     </w:p>
     <w:p>
@@ -11264,15 +12656,37 @@
           <w:lang w:val="en-US"/>
         </w:rPr>
       </w:pPr>
-      <w:r>
-        <w:rPr>
-          <w:rFonts w:ascii="Consolas" w:hAnsi="Consolas" w:cs="Consolas"/>
-          <w:sz w:val="20"/>
-          <w:szCs w:val="20"/>
-          <w:lang w:val="en-US"/>
-        </w:rPr>
-        <w:t>add_user_message(</w:t>
-      </w:r>
+      <w:proofErr w:type="spellStart"/>
+      <w:r>
+        <w:rPr>
+          <w:rFonts w:ascii="Consolas" w:hAnsi="Consolas" w:cs="Consolas"/>
+          <w:sz w:val="20"/>
+          <w:szCs w:val="20"/>
+          <w:lang w:val="en-US"/>
+        </w:rPr>
+        <w:t>add_user_</w:t>
+      </w:r>
+      <w:proofErr w:type="gramStart"/>
+      <w:r>
+        <w:rPr>
+          <w:rFonts w:ascii="Consolas" w:hAnsi="Consolas" w:cs="Consolas"/>
+          <w:sz w:val="20"/>
+          <w:szCs w:val="20"/>
+          <w:lang w:val="en-US"/>
+        </w:rPr>
+        <w:t>message</w:t>
+      </w:r>
+      <w:proofErr w:type="spellEnd"/>
+      <w:r>
+        <w:rPr>
+          <w:rFonts w:ascii="Consolas" w:hAnsi="Consolas" w:cs="Consolas"/>
+          <w:sz w:val="20"/>
+          <w:szCs w:val="20"/>
+          <w:lang w:val="en-US"/>
+        </w:rPr>
+        <w:t>(</w:t>
+      </w:r>
+      <w:proofErr w:type="gramEnd"/>
     </w:p>
     <w:p>
       <w:pPr>
@@ -11439,7 +12853,47 @@
           <w:szCs w:val="20"/>
           <w:lang w:val="en-US"/>
         </w:rPr>
-        <w:t xml:space="preserve">        {"type": "container_upload", "file_id": file_metadata.id},</w:t>
+        <w:t xml:space="preserve">        {"type": "</w:t>
+      </w:r>
+      <w:proofErr w:type="spellStart"/>
+      <w:r>
+        <w:rPr>
+          <w:rFonts w:ascii="Consolas" w:hAnsi="Consolas" w:cs="Consolas"/>
+          <w:sz w:val="20"/>
+          <w:szCs w:val="20"/>
+          <w:lang w:val="en-US"/>
+        </w:rPr>
+        <w:t>container_upload</w:t>
+      </w:r>
+      <w:proofErr w:type="spellEnd"/>
+      <w:r>
+        <w:rPr>
+          <w:rFonts w:ascii="Consolas" w:hAnsi="Consolas" w:cs="Consolas"/>
+          <w:sz w:val="20"/>
+          <w:szCs w:val="20"/>
+          <w:lang w:val="en-US"/>
+        </w:rPr>
+        <w:t>", "</w:t>
+      </w:r>
+      <w:proofErr w:type="spellStart"/>
+      <w:r>
+        <w:rPr>
+          <w:rFonts w:ascii="Consolas" w:hAnsi="Consolas" w:cs="Consolas"/>
+          <w:sz w:val="20"/>
+          <w:szCs w:val="20"/>
+          <w:lang w:val="en-US"/>
+        </w:rPr>
+        <w:t>file_id</w:t>
+      </w:r>
+      <w:proofErr w:type="spellEnd"/>
+      <w:r>
+        <w:rPr>
+          <w:rFonts w:ascii="Consolas" w:hAnsi="Consolas" w:cs="Consolas"/>
+          <w:sz w:val="20"/>
+          <w:szCs w:val="20"/>
+          <w:lang w:val="en-US"/>
+        </w:rPr>
+        <w:t>": file_metadata.id},</w:t>
       </w:r>
     </w:p>
     <w:p>
@@ -11516,6 +12970,7 @@
           <w:lang w:val="en-US"/>
         </w:rPr>
       </w:pPr>
+      <w:proofErr w:type="gramStart"/>
       <w:r>
         <w:rPr>
           <w:rFonts w:ascii="Consolas" w:hAnsi="Consolas" w:cs="Consolas"/>
@@ -11525,6 +12980,7 @@
         </w:rPr>
         <w:t>chat(</w:t>
       </w:r>
+      <w:proofErr w:type="gramEnd"/>
     </w:p>
     <w:p>
       <w:pPr>
@@ -11565,7 +13021,47 @@
           <w:szCs w:val="20"/>
           <w:lang w:val="en-US"/>
         </w:rPr>
-        <w:t xml:space="preserve">    tools=[{"type": "code_execution_20250522", "name": "code_execution"}]</w:t>
+        <w:t xml:space="preserve">    tools</w:t>
+      </w:r>
+      <w:proofErr w:type="gramStart"/>
+      <w:r>
+        <w:rPr>
+          <w:rFonts w:ascii="Consolas" w:hAnsi="Consolas" w:cs="Consolas"/>
+          <w:sz w:val="20"/>
+          <w:szCs w:val="20"/>
+          <w:lang w:val="en-US"/>
+        </w:rPr>
+        <w:t>=[</w:t>
+      </w:r>
+      <w:proofErr w:type="gramEnd"/>
+      <w:r>
+        <w:rPr>
+          <w:rFonts w:ascii="Consolas" w:hAnsi="Consolas" w:cs="Consolas"/>
+          <w:sz w:val="20"/>
+          <w:szCs w:val="20"/>
+          <w:lang w:val="en-US"/>
+        </w:rPr>
+        <w:t>{"type": "code_execution_20250522", "name": "</w:t>
+      </w:r>
+      <w:proofErr w:type="spellStart"/>
+      <w:r>
+        <w:rPr>
+          <w:rFonts w:ascii="Consolas" w:hAnsi="Consolas" w:cs="Consolas"/>
+          <w:sz w:val="20"/>
+          <w:szCs w:val="20"/>
+          <w:lang w:val="en-US"/>
+        </w:rPr>
+        <w:t>code_execution</w:t>
+      </w:r>
+      <w:proofErr w:type="spellEnd"/>
+      <w:r>
+        <w:rPr>
+          <w:rFonts w:ascii="Consolas" w:hAnsi="Consolas" w:cs="Consolas"/>
+          <w:sz w:val="20"/>
+          <w:szCs w:val="20"/>
+          <w:lang w:val="en-US"/>
+        </w:rPr>
+        <w:t>"}]</w:t>
       </w:r>
     </w:p>
     <w:p>
@@ -11654,7 +13150,21 @@
         <w:rPr>
           <w:lang w:val="en-US"/>
         </w:rPr>
-        <w:t>Claude can generate files — like plots or reports — and make them available for download. A generated visualization gets stored in the container; blocks with type: "code_execution_output" in the response contain the file ID for that generated content, which can then be retrieved via the Files API.</w:t>
+        <w:t>Claude can generate files — like plots or reports — and make them available for download. A generated visualization gets stored in the container; blocks with type: "</w:t>
+      </w:r>
+      <w:proofErr w:type="spellStart"/>
+      <w:r>
+        <w:rPr>
+          <w:lang w:val="en-US"/>
+        </w:rPr>
+        <w:t>code_execution_output</w:t>
+      </w:r>
+      <w:proofErr w:type="spellEnd"/>
+      <w:r>
+        <w:rPr>
+          <w:lang w:val="en-US"/>
+        </w:rPr>
+        <w:t>" in the response contain the file ID for that generated content, which can then be retrieved via the Files API.</w:t>
       </w:r>
     </w:p>
     <w:p>
@@ -11668,14 +13178,45 @@
           <w:lang w:val="en-US"/>
         </w:rPr>
       </w:pPr>
-      <w:r>
-        <w:rPr>
-          <w:rFonts w:ascii="Consolas" w:hAnsi="Consolas" w:cs="Consolas"/>
-          <w:sz w:val="20"/>
-          <w:szCs w:val="20"/>
-          <w:lang w:val="en-US"/>
-        </w:rPr>
-        <w:t>download_file("file_id_from_response")</w:t>
+      <w:proofErr w:type="spellStart"/>
+      <w:r>
+        <w:rPr>
+          <w:rFonts w:ascii="Consolas" w:hAnsi="Consolas" w:cs="Consolas"/>
+          <w:sz w:val="20"/>
+          <w:szCs w:val="20"/>
+          <w:lang w:val="en-US"/>
+        </w:rPr>
+        <w:t>download_file</w:t>
+      </w:r>
+      <w:proofErr w:type="spellEnd"/>
+      <w:r>
+        <w:rPr>
+          <w:rFonts w:ascii="Consolas" w:hAnsi="Consolas" w:cs="Consolas"/>
+          <w:sz w:val="20"/>
+          <w:szCs w:val="20"/>
+          <w:lang w:val="en-US"/>
+        </w:rPr>
+        <w:t>("</w:t>
+      </w:r>
+      <w:proofErr w:type="spellStart"/>
+      <w:r>
+        <w:rPr>
+          <w:rFonts w:ascii="Consolas" w:hAnsi="Consolas" w:cs="Consolas"/>
+          <w:sz w:val="20"/>
+          <w:szCs w:val="20"/>
+          <w:lang w:val="en-US"/>
+        </w:rPr>
+        <w:t>file_id_from_response</w:t>
+      </w:r>
+      <w:proofErr w:type="spellEnd"/>
+      <w:r>
+        <w:rPr>
+          <w:rFonts w:ascii="Consolas" w:hAnsi="Consolas" w:cs="Consolas"/>
+          <w:sz w:val="20"/>
+          <w:szCs w:val="20"/>
+          <w:lang w:val="en-US"/>
+        </w:rPr>
+        <w:t>")</w:t>
       </w:r>
     </w:p>
     <w:p>
@@ -11900,12 +13441,14 @@
         <w:ind w:left="400"/>
         <w:rPr>
           <w:rFonts w:ascii="Arial" w:hAnsi="Arial" w:cs="Arial"/>
-          <w:lang w:val="en-US"/>
-        </w:rPr>
-      </w:pPr>
-      <w:r>
-        <w:rPr>
-          <w:rFonts w:ascii="Arial" w:hAnsi="Arial" w:cs="Arial"/>
+          <w:highlight w:val="yellow"/>
+          <w:lang w:val="en-US"/>
+        </w:rPr>
+      </w:pPr>
+      <w:r>
+        <w:rPr>
+          <w:rFonts w:ascii="Arial" w:hAnsi="Arial" w:cs="Arial"/>
+          <w:highlight w:val="yellow"/>
           <w:lang w:val="en-US"/>
         </w:rPr>
         <w:t>B) Upload a file once and reference it later by file ID across multiple messages</w:t>
@@ -12003,12 +13546,14 @@
         <w:ind w:left="400"/>
         <w:rPr>
           <w:rFonts w:ascii="Arial" w:hAnsi="Arial" w:cs="Arial"/>
-          <w:lang w:val="en-US"/>
-        </w:rPr>
-      </w:pPr>
-      <w:r>
-        <w:rPr>
-          <w:rFonts w:ascii="Arial" w:hAnsi="Arial" w:cs="Arial"/>
+          <w:highlight w:val="yellow"/>
+          <w:lang w:val="en-US"/>
+        </w:rPr>
+      </w:pPr>
+      <w:r>
+        <w:rPr>
+          <w:rFonts w:ascii="Arial" w:hAnsi="Arial" w:cs="Arial"/>
+          <w:highlight w:val="yellow"/>
           <w:lang w:val="en-US"/>
         </w:rPr>
         <w:t>B) A server-based tool with a predefined schema — no implementation needs to be provided</w:t>
@@ -12089,12 +13634,14 @@
         <w:ind w:left="400"/>
         <w:rPr>
           <w:rFonts w:ascii="Arial" w:hAnsi="Arial" w:cs="Arial"/>
-          <w:lang w:val="en-US"/>
-        </w:rPr>
-      </w:pPr>
-      <w:r>
-        <w:rPr>
-          <w:rFonts w:ascii="Arial" w:hAnsi="Arial" w:cs="Arial"/>
+          <w:highlight w:val="yellow"/>
+          <w:lang w:val="en-US"/>
+        </w:rPr>
+      </w:pPr>
+      <w:r>
+        <w:rPr>
+          <w:rFonts w:ascii="Arial" w:hAnsi="Arial" w:cs="Arial"/>
+          <w:highlight w:val="yellow"/>
           <w:lang w:val="en-US"/>
         </w:rPr>
         <w:t>A) Because the container has no network access and can't make external API calls</w:t>
@@ -12226,32 +13773,66 @@
         <w:ind w:left="400"/>
         <w:rPr>
           <w:rFonts w:ascii="Arial" w:hAnsi="Arial" w:cs="Arial"/>
-          <w:lang w:val="en-US"/>
-        </w:rPr>
-      </w:pPr>
-      <w:r>
-        <w:rPr>
-          <w:rFonts w:ascii="Arial" w:hAnsi="Arial" w:cs="Arial"/>
-          <w:lang w:val="en-US"/>
-        </w:rPr>
-        <w:t>C) "type": "container_upload"</w:t>
-      </w:r>
-    </w:p>
-    <w:p>
-      <w:pPr>
-        <w:spacing w:after="60" w:line="300" w:lineRule="auto"/>
-        <w:ind w:left="400"/>
-        <w:rPr>
-          <w:rFonts w:ascii="Arial" w:hAnsi="Arial" w:cs="Arial"/>
-          <w:lang w:val="en-US"/>
-        </w:rPr>
-      </w:pPr>
-      <w:r>
-        <w:rPr>
-          <w:rFonts w:ascii="Arial" w:hAnsi="Arial" w:cs="Arial"/>
-          <w:lang w:val="en-US"/>
-        </w:rPr>
-        <w:t>D) "type": "file_reference"</w:t>
+          <w:highlight w:val="yellow"/>
+          <w:lang w:val="en-US"/>
+        </w:rPr>
+      </w:pPr>
+      <w:r>
+        <w:rPr>
+          <w:rFonts w:ascii="Arial" w:hAnsi="Arial" w:cs="Arial"/>
+          <w:highlight w:val="yellow"/>
+          <w:lang w:val="en-US"/>
+        </w:rPr>
+        <w:t>C) "type": "</w:t>
+      </w:r>
+      <w:r>
+        <w:rPr>
+          <w:rFonts w:ascii="Arial" w:hAnsi="Arial" w:cs="Arial"/>
+          <w:highlight w:val="yellow"/>
+          <w:lang w:val="en-US"/>
+        </w:rPr>
+        <w:t>container_upload</w:t>
+      </w:r>
+      <w:r>
+        <w:rPr>
+          <w:rFonts w:ascii="Arial" w:hAnsi="Arial" w:cs="Arial"/>
+          <w:highlight w:val="yellow"/>
+          <w:lang w:val="en-US"/>
+        </w:rPr>
+        <w:t>"</w:t>
+      </w:r>
+    </w:p>
+    <w:p>
+      <w:pPr>
+        <w:spacing w:after="60" w:line="300" w:lineRule="auto"/>
+        <w:ind w:left="400"/>
+        <w:rPr>
+          <w:rFonts w:ascii="Arial" w:hAnsi="Arial" w:cs="Arial"/>
+          <w:lang w:val="en-US"/>
+        </w:rPr>
+      </w:pPr>
+      <w:r>
+        <w:rPr>
+          <w:rFonts w:ascii="Arial" w:hAnsi="Arial" w:cs="Arial"/>
+          <w:lang w:val="en-US"/>
+        </w:rPr>
+        <w:t>D) "type": "</w:t>
+      </w:r>
+      <w:proofErr w:type="spellStart"/>
+      <w:r>
+        <w:rPr>
+          <w:rFonts w:ascii="Arial" w:hAnsi="Arial" w:cs="Arial"/>
+          <w:lang w:val="en-US"/>
+        </w:rPr>
+        <w:t>file_reference</w:t>
+      </w:r>
+      <w:proofErr w:type="spellEnd"/>
+      <w:r>
+        <w:rPr>
+          <w:rFonts w:ascii="Arial" w:hAnsi="Arial" w:cs="Arial"/>
+          <w:lang w:val="en-US"/>
+        </w:rPr>
+        <w:t>"</w:t>
       </w:r>
     </w:p>
     <w:p>
@@ -12269,7 +13850,23 @@
           <w:lang w:val="en-US"/>
         </w:rPr>
         <w:lastRenderedPageBreak/>
-        <w:t>E) "type": "code_execution_input"</w:t>
+        <w:t>E) "type": "</w:t>
+      </w:r>
+      <w:proofErr w:type="spellStart"/>
+      <w:r>
+        <w:rPr>
+          <w:rFonts w:ascii="Arial" w:hAnsi="Arial" w:cs="Arial"/>
+          <w:lang w:val="en-US"/>
+        </w:rPr>
+        <w:t>code_execution_input</w:t>
+      </w:r>
+      <w:proofErr w:type="spellEnd"/>
+      <w:r>
+        <w:rPr>
+          <w:rFonts w:ascii="Arial" w:hAnsi="Arial" w:cs="Arial"/>
+          <w:lang w:val="en-US"/>
+        </w:rPr>
+        <w:t>"</w:t>
       </w:r>
     </w:p>
     <w:p>
@@ -12313,15 +13910,40 @@
         <w:ind w:left="400"/>
         <w:rPr>
           <w:rFonts w:ascii="Arial" w:hAnsi="Arial" w:cs="Arial"/>
-          <w:lang w:val="en-US"/>
-        </w:rPr>
-      </w:pPr>
-      <w:r>
-        <w:rPr>
-          <w:rFonts w:ascii="Arial" w:hAnsi="Arial" w:cs="Arial"/>
-          <w:lang w:val="en-US"/>
-        </w:rPr>
-        <w:t>B) By looking for a code_execution_output block containing a file ID, then downloading it via the Files API</w:t>
+          <w:highlight w:val="yellow"/>
+          <w:lang w:val="en-US"/>
+        </w:rPr>
+      </w:pPr>
+      <w:r>
+        <w:rPr>
+          <w:rFonts w:ascii="Arial" w:hAnsi="Arial" w:cs="Arial"/>
+          <w:lang w:val="en-US"/>
+        </w:rPr>
+        <w:t>B</w:t>
+      </w:r>
+      <w:r>
+        <w:rPr>
+          <w:rFonts w:ascii="Arial" w:hAnsi="Arial" w:cs="Arial"/>
+          <w:highlight w:val="yellow"/>
+          <w:lang w:val="en-US"/>
+        </w:rPr>
+        <w:t xml:space="preserve">) By looking for a </w:t>
+      </w:r>
+      <w:r>
+        <w:rPr>
+          <w:rFonts w:ascii="Arial" w:hAnsi="Arial" w:cs="Arial"/>
+          <w:highlight w:val="yellow"/>
+          <w:lang w:val="en-US"/>
+        </w:rPr>
+        <w:t>code_execution_output</w:t>
+      </w:r>
+      <w:r>
+        <w:rPr>
+          <w:rFonts w:ascii="Arial" w:hAnsi="Arial" w:cs="Arial"/>
+          <w:highlight w:val="yellow"/>
+          <w:lang w:val="en-US"/>
+        </w:rPr>
+        <w:t xml:space="preserve"> block containing a file ID, then downloading it via the Files API</w:t>
       </w:r>
     </w:p>
     <w:p>
@@ -12376,7 +13998,7 @@
       </w:r>
     </w:p>
     <w:sectPr>
-      <w:pgSz w:w="11906" w:h="16838"/>
+      <w:pgSz w:w="11906" w:h="16838" w:orient="portrait"/>
       <w:pgMar w:top="1000" w:right="1200" w:bottom="1000" w:left="1200" w:header="708" w:footer="708" w:gutter="0"/>
       <w:cols w:space="720"/>
       <w:docGrid w:linePitch="360"/>
@@ -12487,7 +14109,7 @@
   <w:docDefaults>
     <w:rPrDefault>
       <w:rPr>
-        <w:rFonts w:ascii="Ink Free" w:eastAsia="Ink Free" w:hAnsi="Ink Free" w:cs="Ink Free"/>
+        <w:rFonts w:ascii="Ink Free" w:hAnsi="Ink Free" w:eastAsia="Ink Free" w:cs="Ink Free"/>
         <w:sz w:val="26"/>
         <w:szCs w:val="26"/>
         <w:lang w:val="pt-BR" w:eastAsia="pt-BR" w:bidi="ar-SA"/>
@@ -12498,14 +14120,14 @@
   <w:latentStyles w:defLockedState="0" w:defUIPriority="99" w:defSemiHidden="0" w:defUnhideWhenUsed="0" w:defQFormat="0" w:count="376">
     <w:lsdException w:name="Normal" w:uiPriority="0" w:qFormat="1"/>
     <w:lsdException w:name="heading 1" w:uiPriority="9" w:qFormat="1"/>
-    <w:lsdException w:name="heading 2" w:semiHidden="1" w:uiPriority="9" w:unhideWhenUsed="1" w:qFormat="1"/>
-    <w:lsdException w:name="heading 3" w:semiHidden="1" w:uiPriority="9" w:unhideWhenUsed="1" w:qFormat="1"/>
-    <w:lsdException w:name="heading 4" w:semiHidden="1" w:uiPriority="9" w:unhideWhenUsed="1" w:qFormat="1"/>
-    <w:lsdException w:name="heading 5" w:semiHidden="1" w:uiPriority="9" w:unhideWhenUsed="1" w:qFormat="1"/>
-    <w:lsdException w:name="heading 6" w:semiHidden="1" w:uiPriority="9" w:unhideWhenUsed="1" w:qFormat="1"/>
-    <w:lsdException w:name="heading 7" w:semiHidden="1" w:uiPriority="9" w:unhideWhenUsed="1" w:qFormat="1"/>
-    <w:lsdException w:name="heading 8" w:semiHidden="1" w:uiPriority="9" w:unhideWhenUsed="1" w:qFormat="1"/>
-    <w:lsdException w:name="heading 9" w:semiHidden="1" w:uiPriority="9" w:unhideWhenUsed="1" w:qFormat="1"/>
+    <w:lsdException w:name="heading 2" w:uiPriority="9" w:semiHidden="1" w:unhideWhenUsed="1" w:qFormat="1"/>
+    <w:lsdException w:name="heading 3" w:uiPriority="9" w:semiHidden="1" w:unhideWhenUsed="1" w:qFormat="1"/>
+    <w:lsdException w:name="heading 4" w:uiPriority="9" w:semiHidden="1" w:unhideWhenUsed="1" w:qFormat="1"/>
+    <w:lsdException w:name="heading 5" w:uiPriority="9" w:semiHidden="1" w:unhideWhenUsed="1" w:qFormat="1"/>
+    <w:lsdException w:name="heading 6" w:uiPriority="9" w:semiHidden="1" w:unhideWhenUsed="1" w:qFormat="1"/>
+    <w:lsdException w:name="heading 7" w:uiPriority="9" w:semiHidden="1" w:unhideWhenUsed="1" w:qFormat="1"/>
+    <w:lsdException w:name="heading 8" w:uiPriority="9" w:semiHidden="1" w:unhideWhenUsed="1" w:qFormat="1"/>
+    <w:lsdException w:name="heading 9" w:uiPriority="9" w:semiHidden="1" w:unhideWhenUsed="1" w:qFormat="1"/>
     <w:lsdException w:name="index 1" w:semiHidden="1" w:unhideWhenUsed="1"/>
     <w:lsdException w:name="index 2" w:semiHidden="1" w:unhideWhenUsed="1"/>
     <w:lsdException w:name="index 3" w:semiHidden="1" w:unhideWhenUsed="1"/>
@@ -12515,22 +14137,22 @@
     <w:lsdException w:name="index 7" w:semiHidden="1" w:unhideWhenUsed="1"/>
     <w:lsdException w:name="index 8" w:semiHidden="1" w:unhideWhenUsed="1"/>
     <w:lsdException w:name="index 9" w:semiHidden="1" w:unhideWhenUsed="1"/>
-    <w:lsdException w:name="toc 1" w:semiHidden="1" w:uiPriority="39" w:unhideWhenUsed="1"/>
-    <w:lsdException w:name="toc 2" w:semiHidden="1" w:uiPriority="39" w:unhideWhenUsed="1"/>
-    <w:lsdException w:name="toc 3" w:semiHidden="1" w:uiPriority="39" w:unhideWhenUsed="1"/>
-    <w:lsdException w:name="toc 4" w:semiHidden="1" w:uiPriority="39" w:unhideWhenUsed="1"/>
-    <w:lsdException w:name="toc 5" w:semiHidden="1" w:uiPriority="39" w:unhideWhenUsed="1"/>
-    <w:lsdException w:name="toc 6" w:semiHidden="1" w:uiPriority="39" w:unhideWhenUsed="1"/>
-    <w:lsdException w:name="toc 7" w:semiHidden="1" w:uiPriority="39" w:unhideWhenUsed="1"/>
-    <w:lsdException w:name="toc 8" w:semiHidden="1" w:uiPriority="39" w:unhideWhenUsed="1"/>
-    <w:lsdException w:name="toc 9" w:semiHidden="1" w:uiPriority="39" w:unhideWhenUsed="1"/>
+    <w:lsdException w:name="toc 1" w:uiPriority="39" w:semiHidden="1" w:unhideWhenUsed="1"/>
+    <w:lsdException w:name="toc 2" w:uiPriority="39" w:semiHidden="1" w:unhideWhenUsed="1"/>
+    <w:lsdException w:name="toc 3" w:uiPriority="39" w:semiHidden="1" w:unhideWhenUsed="1"/>
+    <w:lsdException w:name="toc 4" w:uiPriority="39" w:semiHidden="1" w:unhideWhenUsed="1"/>
+    <w:lsdException w:name="toc 5" w:uiPriority="39" w:semiHidden="1" w:unhideWhenUsed="1"/>
+    <w:lsdException w:name="toc 6" w:uiPriority="39" w:semiHidden="1" w:unhideWhenUsed="1"/>
+    <w:lsdException w:name="toc 7" w:uiPriority="39" w:semiHidden="1" w:unhideWhenUsed="1"/>
+    <w:lsdException w:name="toc 8" w:uiPriority="39" w:semiHidden="1" w:unhideWhenUsed="1"/>
+    <w:lsdException w:name="toc 9" w:uiPriority="39" w:semiHidden="1" w:unhideWhenUsed="1"/>
     <w:lsdException w:name="Normal Indent" w:semiHidden="1" w:unhideWhenUsed="1"/>
     <w:lsdException w:name="footnote text" w:semiHidden="1" w:unhideWhenUsed="1"/>
     <w:lsdException w:name="annotation text" w:semiHidden="1" w:unhideWhenUsed="1"/>
     <w:lsdException w:name="header" w:semiHidden="1" w:unhideWhenUsed="1"/>
     <w:lsdException w:name="footer" w:semiHidden="1" w:unhideWhenUsed="1"/>
     <w:lsdException w:name="index heading" w:semiHidden="1" w:unhideWhenUsed="1"/>
-    <w:lsdException w:name="caption" w:semiHidden="1" w:uiPriority="35" w:unhideWhenUsed="1" w:qFormat="1"/>
+    <w:lsdException w:name="caption" w:uiPriority="35" w:semiHidden="1" w:unhideWhenUsed="1" w:qFormat="1"/>
     <w:lsdException w:name="table of figures" w:semiHidden="1" w:unhideWhenUsed="1"/>
     <w:lsdException w:name="envelope address" w:semiHidden="1" w:unhideWhenUsed="1"/>
     <w:lsdException w:name="envelope return" w:semiHidden="1" w:unhideWhenUsed="1"/>
@@ -12561,7 +14183,7 @@
     <w:lsdException w:name="Title" w:uiPriority="10" w:qFormat="1"/>
     <w:lsdException w:name="Closing" w:semiHidden="1" w:unhideWhenUsed="1"/>
     <w:lsdException w:name="Signature" w:semiHidden="1" w:unhideWhenUsed="1"/>
-    <w:lsdException w:name="Default Paragraph Font" w:semiHidden="1" w:uiPriority="1" w:unhideWhenUsed="1"/>
+    <w:lsdException w:name="Default Paragraph Font" w:uiPriority="1" w:semiHidden="1" w:unhideWhenUsed="1"/>
     <w:lsdException w:name="Body Text" w:semiHidden="1" w:unhideWhenUsed="1"/>
     <w:lsdException w:name="Body Text Indent" w:semiHidden="1" w:unhideWhenUsed="1"/>
     <w:lsdException w:name="List Continue" w:semiHidden="1" w:unhideWhenUsed="1"/>
@@ -12761,8 +14383,8 @@
     <w:lsdException w:name="Subtle Reference" w:uiPriority="31" w:qFormat="1"/>
     <w:lsdException w:name="Intense Reference" w:uiPriority="32" w:qFormat="1"/>
     <w:lsdException w:name="Book Title" w:uiPriority="33" w:qFormat="1"/>
-    <w:lsdException w:name="Bibliography" w:semiHidden="1" w:uiPriority="37" w:unhideWhenUsed="1"/>
-    <w:lsdException w:name="TOC Heading" w:semiHidden="1" w:uiPriority="39" w:unhideWhenUsed="1" w:qFormat="1"/>
+    <w:lsdException w:name="Bibliography" w:uiPriority="37" w:semiHidden="1" w:unhideWhenUsed="1"/>
+    <w:lsdException w:name="TOC Heading" w:uiPriority="39" w:semiHidden="1" w:unhideWhenUsed="1" w:qFormat="1"/>
     <w:lsdException w:name="Plain Table 1" w:uiPriority="41"/>
     <w:lsdException w:name="Plain Table 2" w:uiPriority="42"/>
     <w:lsdException w:name="Plain Table 3" w:uiPriority="43"/>
@@ -12873,7 +14495,7 @@
     <w:lsdException w:name="Unresolved Mention" w:semiHidden="1" w:unhideWhenUsed="1"/>
     <w:lsdException w:name="Smart Link" w:semiHidden="1" w:unhideWhenUsed="1"/>
   </w:latentStyles>
-  <w:style w:type="paragraph" w:default="1" w:styleId="Normal">
+  <w:style w:type="paragraph" w:styleId="Normal" w:default="1">
     <w:name w:val="Normal"/>
     <w:qFormat/>
   </w:style>
@@ -12958,13 +14580,13 @@
       <w:color w:val="1F4D78"/>
     </w:rPr>
   </w:style>
-  <w:style w:type="character" w:default="1" w:styleId="Fontepargpadro">
+  <w:style w:type="character" w:styleId="Fontepargpadro" w:default="1">
     <w:name w:val="Default Paragraph Font"/>
     <w:uiPriority w:val="1"/>
     <w:semiHidden/>
     <w:unhideWhenUsed/>
   </w:style>
-  <w:style w:type="table" w:default="1" w:styleId="Tabelanormal">
+  <w:style w:type="table" w:styleId="Tabelanormal" w:default="1">
     <w:name w:val="Normal Table"/>
     <w:uiPriority w:val="99"/>
     <w:semiHidden/>
@@ -12979,7 +14601,7 @@
       </w:tblCellMar>
     </w:tblPr>
   </w:style>
-  <w:style w:type="numbering" w:default="1" w:styleId="Semlista">
+  <w:style w:type="numbering" w:styleId="Semlista" w:default="1">
     <w:name w:val="No List"/>
     <w:uiPriority w:val="99"/>
     <w:semiHidden/>
@@ -12994,7 +14616,7 @@
       <w:szCs w:val="56"/>
     </w:rPr>
   </w:style>
-  <w:style w:type="paragraph" w:customStyle="1" w:styleId="Forte1">
+  <w:style w:type="paragraph" w:styleId="Forte1" w:customStyle="1">
     <w:name w:val="Forte1"/>
     <w:qFormat/>
     <w:rPr>
@@ -13035,7 +14657,7 @@
       <w:szCs w:val="20"/>
     </w:rPr>
   </w:style>
-  <w:style w:type="character" w:customStyle="1" w:styleId="TextodenotaderodapChar">
+  <w:style w:type="character" w:styleId="TextodenotaderodapChar" w:customStyle="1">
     <w:name w:val="Texto de nota de rodapé Char"/>
     <w:link w:val="Textodenotaderodap"/>
     <w:uiPriority w:val="99"/>
@@ -13066,7 +14688,7 @@
       <w:szCs w:val="20"/>
     </w:rPr>
   </w:style>
-  <w:style w:type="character" w:customStyle="1" w:styleId="TextodenotadefimChar">
+  <w:style w:type="character" w:styleId="TextodenotadefimChar" w:customStyle="1">
     <w:name w:val="Texto de nota de fim Char"/>
     <w:link w:val="Textodenotadefim"/>
     <w:uiPriority w:val="99"/>
@@ -13081,7 +14703,7 @@
 </file>
 
 <file path=word/theme/theme1.xml><?xml version="1.0" encoding="utf-8"?>
-<a:theme xmlns:a="http://schemas.openxmlformats.org/drawingml/2006/main" name="Tema do Office">
+<a:theme xmlns:a="http://schemas.openxmlformats.org/drawingml/2006/main" xmlns:thm15="http://schemas.microsoft.com/office/thememl/2012/main" name="Tema do Office">
   <a:themeElements>
     <a:clrScheme name="Office">
       <a:dk1>

</xml_diff>